<commit_message>
docs: tailor customer API guide to service site
</commit_message>
<xml_diff>
--- a/docs/USER_REDEEM_AND_API_GUIDE_CN.docx
+++ b/docs/USER_REDEEM_AND_API_GUIDE_CN.docx
@@ -13,7 +13,7 @@
           <w:color w:val="2E74B5"/>
           <w:sz w:val="22"/>
         </w:rPr>
-        <w:t>新手上手指南</w:t>
+        <w:t>客户使用指南</w:t>
       </w:r>
     </w:p>
     <w:p>
@@ -27,7 +27,7 @@
           <w:color w:val="1F4D78"/>
           <w:sz w:val="48"/>
         </w:rPr>
-        <w:t>中转站账号注册、兑换码与 API 使用说明书</w:t>
+        <w:t>我们的 AI 中转站：注册、充值/兑换与 API 接入</w:t>
       </w:r>
     </w:p>
     <w:p>
@@ -40,690 +40,7 @@
           <w:color w:val="5B6770"/>
           <w:sz w:val="25"/>
         </w:rPr>
-        <w:t>面向第一次使用大模型 API 的用户：按步骤完成注册、兑换额度、复制 URL 和 Key，并在工具或代码中完成调用。</w:t>
-      </w:r>
-    </w:p>
-    <w:tbl>
-      <w:tblPr>
-        <w:tblW w:type="dxa" w:w="9360"/>
-        <w:tblLayout w:type="fixed"/>
-        <w:tblLook w:firstColumn="1" w:firstRow="1" w:lastColumn="0" w:lastRow="0" w:noHBand="0" w:noVBand="1" w:val="04A0"/>
-        <w:jc w:val="left"/>
-        <w:tblInd w:w="120" w:type="dxa"/>
-        <w:tblBorders>
-          <w:top w:val="single" w:sz="6" w:space="0" w:color="D7DBE2"/>
-          <w:left w:val="single" w:sz="6" w:space="0" w:color="D7DBE2"/>
-          <w:bottom w:val="single" w:sz="6" w:space="0" w:color="D7DBE2"/>
-          <w:right w:val="single" w:sz="6" w:space="0" w:color="D7DBE2"/>
-          <w:insideH w:val="single" w:sz="6" w:space="0" w:color="D7DBE2"/>
-          <w:insideV w:val="single" w:sz="6" w:space="0" w:color="D7DBE2"/>
-        </w:tblBorders>
-      </w:tblPr>
-      <w:tblGrid>
-        <w:gridCol w:w="2300"/>
-        <w:gridCol w:w="7060"/>
-      </w:tblGrid>
-      <w:tr>
-        <w:trPr>
-          <w:tblHeader/>
-        </w:trPr>
-        <w:tc>
-          <w:tcPr>
-            <w:tcW w:type="dxa" w:w="2300"/>
-            <w:vAlign w:val="center"/>
-            <w:tcMar>
-              <w:top w:w="100" w:type="dxa"/>
-              <w:start w:w="140" w:type="dxa"/>
-              <w:bottom w:w="100" w:type="dxa"/>
-              <w:end w:w="140" w:type="dxa"/>
-            </w:tcMar>
-            <w:shd w:fill="F2F4F7"/>
-          </w:tcPr>
-          <w:p>
-            <w:pPr>
-              <w:spacing w:before="0" w:after="0" w:line="276" w:lineRule="auto"/>
-            </w:pPr>
-            <w:r>
-              <w:rPr>
-                <w:rFonts w:ascii="Calibri" w:hAnsi="Calibri" w:eastAsia="Microsoft YaHei"/>
-                <w:b/>
-                <w:color w:val="212529"/>
-                <w:sz w:val="21"/>
-              </w:rPr>
-              <w:t>你会完成</w:t>
-            </w:r>
-          </w:p>
-        </w:tc>
-        <w:tc>
-          <w:tcPr>
-            <w:tcW w:type="dxa" w:w="7060"/>
-            <w:vAlign w:val="center"/>
-            <w:tcMar>
-              <w:top w:w="100" w:type="dxa"/>
-              <w:start w:w="140" w:type="dxa"/>
-              <w:bottom w:w="100" w:type="dxa"/>
-              <w:end w:w="140" w:type="dxa"/>
-            </w:tcMar>
-            <w:shd w:fill="F2F4F7"/>
-          </w:tcPr>
-          <w:p>
-            <w:pPr>
-              <w:spacing w:before="0" w:after="0" w:line="276" w:lineRule="auto"/>
-            </w:pPr>
-            <w:r>
-              <w:rPr>
-                <w:rFonts w:ascii="Calibri" w:hAnsi="Calibri" w:eastAsia="Microsoft YaHei"/>
-                <w:b/>
-                <w:color w:val="212529"/>
-                <w:sz w:val="21"/>
-              </w:rPr>
-              <w:t>结果</w:t>
-            </w:r>
-          </w:p>
-        </w:tc>
-      </w:tr>
-      <w:tr>
-        <w:tc>
-          <w:tcPr>
-            <w:tcW w:type="dxa" w:w="2300"/>
-            <w:vAlign w:val="center"/>
-            <w:tcMar>
-              <w:top w:w="100" w:type="dxa"/>
-              <w:start w:w="140" w:type="dxa"/>
-              <w:bottom w:w="100" w:type="dxa"/>
-              <w:end w:w="140" w:type="dxa"/>
-            </w:tcMar>
-          </w:tcPr>
-          <w:p>
-            <w:pPr>
-              <w:spacing w:before="0" w:after="0" w:line="276" w:lineRule="auto"/>
-            </w:pPr>
-            <w:r>
-              <w:rPr>
-                <w:rFonts w:ascii="Calibri" w:hAnsi="Calibri" w:eastAsia="Microsoft YaHei"/>
-                <w:color w:val="212529"/>
-                <w:sz w:val="21"/>
-              </w:rPr>
-              <w:t>注册账号</w:t>
-            </w:r>
-          </w:p>
-        </w:tc>
-        <w:tc>
-          <w:tcPr>
-            <w:tcW w:type="dxa" w:w="7060"/>
-            <w:vAlign w:val="center"/>
-            <w:tcMar>
-              <w:top w:w="100" w:type="dxa"/>
-              <w:start w:w="140" w:type="dxa"/>
-              <w:bottom w:w="100" w:type="dxa"/>
-              <w:end w:w="140" w:type="dxa"/>
-            </w:tcMar>
-          </w:tcPr>
-          <w:p>
-            <w:pPr>
-              <w:spacing w:before="0" w:after="0" w:line="276" w:lineRule="auto"/>
-            </w:pPr>
-            <w:r>
-              <w:rPr>
-                <w:rFonts w:ascii="Calibri" w:hAnsi="Calibri" w:eastAsia="Microsoft YaHei"/>
-                <w:color w:val="212529"/>
-                <w:sz w:val="21"/>
-              </w:rPr>
-              <w:t>能登录中转站后台</w:t>
-            </w:r>
-          </w:p>
-        </w:tc>
-      </w:tr>
-      <w:tr>
-        <w:tc>
-          <w:tcPr>
-            <w:tcW w:type="dxa" w:w="2300"/>
-            <w:vAlign w:val="center"/>
-            <w:tcMar>
-              <w:top w:w="100" w:type="dxa"/>
-              <w:start w:w="140" w:type="dxa"/>
-              <w:bottom w:w="100" w:type="dxa"/>
-              <w:end w:w="140" w:type="dxa"/>
-            </w:tcMar>
-          </w:tcPr>
-          <w:p>
-            <w:pPr>
-              <w:spacing w:before="0" w:after="0" w:line="276" w:lineRule="auto"/>
-            </w:pPr>
-            <w:r>
-              <w:rPr>
-                <w:rFonts w:ascii="Calibri" w:hAnsi="Calibri" w:eastAsia="Microsoft YaHei"/>
-                <w:color w:val="212529"/>
-                <w:sz w:val="21"/>
-              </w:rPr>
-              <w:t>兑换额度</w:t>
-            </w:r>
-          </w:p>
-        </w:tc>
-        <w:tc>
-          <w:tcPr>
-            <w:tcW w:type="dxa" w:w="7060"/>
-            <w:vAlign w:val="center"/>
-            <w:tcMar>
-              <w:top w:w="100" w:type="dxa"/>
-              <w:start w:w="140" w:type="dxa"/>
-              <w:bottom w:w="100" w:type="dxa"/>
-              <w:end w:w="140" w:type="dxa"/>
-            </w:tcMar>
-          </w:tcPr>
-          <w:p>
-            <w:pPr>
-              <w:spacing w:before="0" w:after="0" w:line="276" w:lineRule="auto"/>
-            </w:pPr>
-            <w:r>
-              <w:rPr>
-                <w:rFonts w:ascii="Calibri" w:hAnsi="Calibri" w:eastAsia="Microsoft YaHei"/>
-                <w:color w:val="212529"/>
-                <w:sz w:val="21"/>
-              </w:rPr>
-              <w:t>余额中能看到可用额度</w:t>
-            </w:r>
-          </w:p>
-        </w:tc>
-      </w:tr>
-      <w:tr>
-        <w:tc>
-          <w:tcPr>
-            <w:tcW w:type="dxa" w:w="2300"/>
-            <w:vAlign w:val="center"/>
-            <w:tcMar>
-              <w:top w:w="100" w:type="dxa"/>
-              <w:start w:w="140" w:type="dxa"/>
-              <w:bottom w:w="100" w:type="dxa"/>
-              <w:end w:w="140" w:type="dxa"/>
-            </w:tcMar>
-          </w:tcPr>
-          <w:p>
-            <w:pPr>
-              <w:spacing w:before="0" w:after="0" w:line="276" w:lineRule="auto"/>
-            </w:pPr>
-            <w:r>
-              <w:rPr>
-                <w:rFonts w:ascii="Calibri" w:hAnsi="Calibri" w:eastAsia="Microsoft YaHei"/>
-                <w:color w:val="212529"/>
-                <w:sz w:val="21"/>
-              </w:rPr>
-              <w:t>获取 URL 和 Key</w:t>
-            </w:r>
-          </w:p>
-        </w:tc>
-        <w:tc>
-          <w:tcPr>
-            <w:tcW w:type="dxa" w:w="7060"/>
-            <w:vAlign w:val="center"/>
-            <w:tcMar>
-              <w:top w:w="100" w:type="dxa"/>
-              <w:start w:w="140" w:type="dxa"/>
-              <w:bottom w:w="100" w:type="dxa"/>
-              <w:end w:w="140" w:type="dxa"/>
-            </w:tcMar>
-          </w:tcPr>
-          <w:p>
-            <w:pPr>
-              <w:spacing w:before="0" w:after="0" w:line="276" w:lineRule="auto"/>
-            </w:pPr>
-            <w:r>
-              <w:rPr>
-                <w:rFonts w:ascii="Calibri" w:hAnsi="Calibri" w:eastAsia="Microsoft YaHei"/>
-                <w:color w:val="212529"/>
-                <w:sz w:val="21"/>
-              </w:rPr>
-              <w:t>拿到 Base URL 与 API Key</w:t>
-            </w:r>
-          </w:p>
-        </w:tc>
-      </w:tr>
-      <w:tr>
-        <w:tc>
-          <w:tcPr>
-            <w:tcW w:type="dxa" w:w="2300"/>
-            <w:vAlign w:val="center"/>
-            <w:tcMar>
-              <w:top w:w="100" w:type="dxa"/>
-              <w:start w:w="140" w:type="dxa"/>
-              <w:bottom w:w="100" w:type="dxa"/>
-              <w:end w:w="140" w:type="dxa"/>
-            </w:tcMar>
-          </w:tcPr>
-          <w:p>
-            <w:pPr>
-              <w:spacing w:before="0" w:after="0" w:line="276" w:lineRule="auto"/>
-            </w:pPr>
-            <w:r>
-              <w:rPr>
-                <w:rFonts w:ascii="Calibri" w:hAnsi="Calibri" w:eastAsia="Microsoft YaHei"/>
-                <w:color w:val="212529"/>
-                <w:sz w:val="21"/>
-              </w:rPr>
-              <w:t>测试调用</w:t>
-            </w:r>
-          </w:p>
-        </w:tc>
-        <w:tc>
-          <w:tcPr>
-            <w:tcW w:type="dxa" w:w="7060"/>
-            <w:vAlign w:val="center"/>
-            <w:tcMar>
-              <w:top w:w="100" w:type="dxa"/>
-              <w:start w:w="140" w:type="dxa"/>
-              <w:bottom w:w="100" w:type="dxa"/>
-              <w:end w:w="140" w:type="dxa"/>
-            </w:tcMar>
-          </w:tcPr>
-          <w:p>
-            <w:pPr>
-              <w:spacing w:before="0" w:after="0" w:line="276" w:lineRule="auto"/>
-            </w:pPr>
-            <w:r>
-              <w:rPr>
-                <w:rFonts w:ascii="Calibri" w:hAnsi="Calibri" w:eastAsia="Microsoft YaHei"/>
-                <w:color w:val="212529"/>
-                <w:sz w:val="21"/>
-              </w:rPr>
-              <w:t>能成功收到大模型回复</w:t>
-            </w:r>
-          </w:p>
-        </w:tc>
-      </w:tr>
-    </w:tbl>
-    <w:p>
-      <w:pPr>
-        <w:spacing w:after="80"/>
-      </w:pPr>
-    </w:p>
-    <w:tbl>
-      <w:tblPr>
-        <w:tblW w:type="dxa" w:w="9360"/>
-        <w:jc w:val="left"/>
-        <w:tblLayout w:type="fixed"/>
-        <w:tblLook w:firstColumn="1" w:firstRow="1" w:lastColumn="0" w:lastRow="0" w:noHBand="0" w:noVBand="1" w:val="04A0"/>
-        <w:tblInd w:w="120" w:type="dxa"/>
-        <w:tblBorders>
-          <w:top w:val="single" w:sz="4" w:space="0" w:color="E2E7EE"/>
-          <w:left w:val="single" w:sz="4" w:space="0" w:color="E2E7EE"/>
-          <w:bottom w:val="single" w:sz="4" w:space="0" w:color="E2E7EE"/>
-          <w:right w:val="single" w:sz="4" w:space="0" w:color="E2E7EE"/>
-          <w:insideH w:val="single" w:sz="4" w:space="0" w:color="E2E7EE"/>
-          <w:insideV w:val="single" w:sz="4" w:space="0" w:color="E2E7EE"/>
-        </w:tblBorders>
-      </w:tblPr>
-      <w:tblGrid>
-        <w:gridCol w:w="9360"/>
-      </w:tblGrid>
-      <w:tr>
-        <w:tc>
-          <w:tcPr>
-            <w:tcW w:type="dxa" w:w="9360"/>
-            <w:vAlign w:val="center"/>
-            <w:tcMar>
-              <w:top w:w="100" w:type="dxa"/>
-              <w:start w:w="140" w:type="dxa"/>
-              <w:bottom w:w="100" w:type="dxa"/>
-              <w:end w:w="140" w:type="dxa"/>
-            </w:tcMar>
-            <w:shd w:fill="F4F6F9"/>
-          </w:tcPr>
-          <w:p>
-            <w:pPr>
-              <w:spacing w:before="0" w:after="40" w:line="300" w:lineRule="auto"/>
-            </w:pPr>
-            <w:r>
-              <w:rPr>
-                <w:rFonts w:ascii="Calibri" w:hAnsi="Calibri" w:eastAsia="Microsoft YaHei"/>
-                <w:b/>
-                <w:color w:val="1F4D78"/>
-                <w:sz w:val="21"/>
-              </w:rPr>
-              <w:t>重要提醒</w:t>
-            </w:r>
-          </w:p>
-          <w:p>
-            <w:pPr>
-              <w:spacing w:before="0" w:after="0" w:line="288" w:lineRule="auto"/>
-            </w:pPr>
-            <w:r>
-              <w:rPr>
-                <w:rFonts w:ascii="Calibri" w:hAnsi="Calibri" w:eastAsia="Microsoft YaHei"/>
-                <w:color w:val="212529"/>
-                <w:sz w:val="21"/>
-              </w:rPr>
-              <w:t>本文中的域名、API Key 和模型名都是示例。实际填写时，请以平台后台展示的信息为准。API Key 等同于额度使用凭证，请像密码一样保管。</w:t>
-            </w:r>
-          </w:p>
-        </w:tc>
-      </w:tr>
-    </w:tbl>
-    <w:p>
-      <w:pPr>
-        <w:spacing w:after="40"/>
-      </w:pPr>
-    </w:p>
-    <w:p>
-      <w:pPr>
-        <w:pStyle w:val="Heading1"/>
-        <w:spacing w:before="360" w:after="200" w:line="264" w:lineRule="auto"/>
-      </w:pPr>
-      <w:r>
-        <w:rPr>
-          <w:rFonts w:ascii="Calibri" w:hAnsi="Calibri" w:eastAsia="Microsoft YaHei"/>
-          <w:b/>
-          <w:color w:val="2E74B5"/>
-          <w:sz w:val="32"/>
-        </w:rPr>
-        <w:t>一分钟快速上手</w:t>
-      </w:r>
-    </w:p>
-    <w:p>
-      <w:pPr>
-        <w:pStyle w:val="ListNumber"/>
-        <w:spacing w:before="0" w:after="80" w:line="300" w:lineRule="auto"/>
-      </w:pPr>
-      <w:r>
-        <w:rPr>
-          <w:rFonts w:ascii="Calibri" w:hAnsi="Calibri" w:eastAsia="Microsoft YaHei"/>
-          <w:color w:val="212529"/>
-          <w:sz w:val="22"/>
-        </w:rPr>
-        <w:t>打开中转站网址，例如：https://你的中转站域名</w:t>
-      </w:r>
-    </w:p>
-    <w:p>
-      <w:pPr>
-        <w:pStyle w:val="ListNumber"/>
-        <w:spacing w:before="0" w:after="80" w:line="300" w:lineRule="auto"/>
-      </w:pPr>
-      <w:r>
-        <w:rPr>
-          <w:rFonts w:ascii="Calibri" w:hAnsi="Calibri" w:eastAsia="Microsoft YaHei"/>
-          <w:color w:val="212529"/>
-          <w:sz w:val="22"/>
-        </w:rPr>
-        <w:t>注册账号并登录后台。</w:t>
-      </w:r>
-    </w:p>
-    <w:p>
-      <w:pPr>
-        <w:pStyle w:val="ListNumber"/>
-        <w:spacing w:before="0" w:after="80" w:line="300" w:lineRule="auto"/>
-      </w:pPr>
-      <w:r>
-        <w:rPr>
-          <w:rFonts w:ascii="Calibri" w:hAnsi="Calibri" w:eastAsia="Microsoft YaHei"/>
-          <w:color w:val="212529"/>
-          <w:sz w:val="22"/>
-        </w:rPr>
-        <w:t>进入「兑换码」「充值」或「余额」页面，输入兑换码并确认兑换。</w:t>
-      </w:r>
-    </w:p>
-    <w:p>
-      <w:pPr>
-        <w:pStyle w:val="ListNumber"/>
-        <w:spacing w:before="0" w:after="80" w:line="300" w:lineRule="auto"/>
-      </w:pPr>
-      <w:r>
-        <w:rPr>
-          <w:rFonts w:ascii="Calibri" w:hAnsi="Calibri" w:eastAsia="Microsoft YaHei"/>
-          <w:color w:val="212529"/>
-          <w:sz w:val="22"/>
-        </w:rPr>
-        <w:t>进入「API Key」「令牌」或「密钥」页面，创建并复制 API Key。</w:t>
-      </w:r>
-    </w:p>
-    <w:p>
-      <w:pPr>
-        <w:pStyle w:val="ListNumber"/>
-        <w:spacing w:before="0" w:after="80" w:line="300" w:lineRule="auto"/>
-      </w:pPr>
-      <w:r>
-        <w:rPr>
-          <w:rFonts w:ascii="Calibri" w:hAnsi="Calibri" w:eastAsia="Microsoft YaHei"/>
-          <w:color w:val="212529"/>
-          <w:sz w:val="22"/>
-        </w:rPr>
-        <w:t>找到平台提供的 API URL，通常类似：https://你的中转站域名/v1</w:t>
-      </w:r>
-    </w:p>
-    <w:p>
-      <w:pPr>
-        <w:pStyle w:val="ListNumber"/>
-        <w:spacing w:before="0" w:after="80" w:line="300" w:lineRule="auto"/>
-      </w:pPr>
-      <w:r>
-        <w:rPr>
-          <w:rFonts w:ascii="Calibri" w:hAnsi="Calibri" w:eastAsia="Microsoft YaHei"/>
-          <w:color w:val="212529"/>
-          <w:sz w:val="22"/>
-        </w:rPr>
-        <w:t>在工具里填写 Base URL、API Key 和模型名。</w:t>
-      </w:r>
-    </w:p>
-    <w:p>
-      <w:pPr>
-        <w:pStyle w:val="ListNumber"/>
-        <w:spacing w:before="0" w:after="80" w:line="300" w:lineRule="auto"/>
-      </w:pPr>
-      <w:r>
-        <w:rPr>
-          <w:rFonts w:ascii="Calibri" w:hAnsi="Calibri" w:eastAsia="Microsoft YaHei"/>
-          <w:color w:val="212529"/>
-          <w:sz w:val="22"/>
-        </w:rPr>
-        <w:t>发送一句「你好」，能收到回复就说明配置成功。</w:t>
-      </w:r>
-    </w:p>
-    <w:p>
-      <w:pPr>
-        <w:pStyle w:val="Heading1"/>
-        <w:spacing w:before="360" w:after="200" w:line="264" w:lineRule="auto"/>
-      </w:pPr>
-      <w:r>
-        <w:rPr>
-          <w:rFonts w:ascii="Calibri" w:hAnsi="Calibri" w:eastAsia="Microsoft YaHei"/>
-          <w:b/>
-          <w:color w:val="2E74B5"/>
-          <w:sz w:val="32"/>
-        </w:rPr>
-        <w:t>第一步：注册账号</w:t>
-      </w:r>
-    </w:p>
-    <w:p>
-      <w:pPr>
-        <w:pStyle w:val="ListNumber"/>
-        <w:spacing w:before="0" w:after="80" w:line="300" w:lineRule="auto"/>
-      </w:pPr>
-      <w:r>
-        <w:rPr>
-          <w:rFonts w:ascii="Calibri" w:hAnsi="Calibri" w:eastAsia="Microsoft YaHei"/>
-          <w:color w:val="212529"/>
-          <w:sz w:val="22"/>
-        </w:rPr>
-        <w:t>打开中转站官网或客服提供的注册链接。</w:t>
-      </w:r>
-    </w:p>
-    <w:p>
-      <w:pPr>
-        <w:pStyle w:val="ListNumber"/>
-        <w:spacing w:before="0" w:after="80" w:line="300" w:lineRule="auto"/>
-      </w:pPr>
-      <w:r>
-        <w:rPr>
-          <w:rFonts w:ascii="Calibri" w:hAnsi="Calibri" w:eastAsia="Microsoft YaHei"/>
-          <w:color w:val="212529"/>
-          <w:sz w:val="22"/>
-        </w:rPr>
-        <w:t>点击「注册」「Sign up」或「创建账号」。</w:t>
-      </w:r>
-    </w:p>
-    <w:p>
-      <w:pPr>
-        <w:pStyle w:val="ListNumber"/>
-        <w:spacing w:before="0" w:after="80" w:line="300" w:lineRule="auto"/>
-      </w:pPr>
-      <w:r>
-        <w:rPr>
-          <w:rFonts w:ascii="Calibri" w:hAnsi="Calibri" w:eastAsia="Microsoft YaHei"/>
-          <w:color w:val="212529"/>
-          <w:sz w:val="22"/>
-        </w:rPr>
-        <w:t>按页面要求填写邮箱、手机号或用户名。</w:t>
-      </w:r>
-    </w:p>
-    <w:p>
-      <w:pPr>
-        <w:pStyle w:val="ListNumber"/>
-        <w:spacing w:before="0" w:after="80" w:line="300" w:lineRule="auto"/>
-      </w:pPr>
-      <w:r>
-        <w:rPr>
-          <w:rFonts w:ascii="Calibri" w:hAnsi="Calibri" w:eastAsia="Microsoft YaHei"/>
-          <w:color w:val="212529"/>
-          <w:sz w:val="22"/>
-        </w:rPr>
-        <w:t>设置密码，建议不低于 8 位，并混合字母、数字和符号。</w:t>
-      </w:r>
-    </w:p>
-    <w:p>
-      <w:pPr>
-        <w:pStyle w:val="ListNumber"/>
-        <w:spacing w:before="0" w:after="80" w:line="300" w:lineRule="auto"/>
-      </w:pPr>
-      <w:r>
-        <w:rPr>
-          <w:rFonts w:ascii="Calibri" w:hAnsi="Calibri" w:eastAsia="Microsoft YaHei"/>
-          <w:color w:val="212529"/>
-          <w:sz w:val="22"/>
-        </w:rPr>
-        <w:t>如果页面要求验证码，请按提示完成邮箱验证、短信验证或图形验证。</w:t>
-      </w:r>
-    </w:p>
-    <w:p>
-      <w:pPr>
-        <w:pStyle w:val="ListNumber"/>
-        <w:spacing w:before="0" w:after="80" w:line="300" w:lineRule="auto"/>
-      </w:pPr>
-      <w:r>
-        <w:rPr>
-          <w:rFonts w:ascii="Calibri" w:hAnsi="Calibri" w:eastAsia="Microsoft YaHei"/>
-          <w:color w:val="212529"/>
-          <w:sz w:val="22"/>
-        </w:rPr>
-        <w:t>注册成功后，回到登录页输入账号和密码登录。</w:t>
-      </w:r>
-    </w:p>
-    <w:p>
-      <w:pPr>
-        <w:spacing w:before="0" w:after="120" w:line="300" w:lineRule="auto"/>
-      </w:pPr>
-      <w:r>
-        <w:rPr>
-          <w:rFonts w:ascii="Calibri" w:hAnsi="Calibri" w:eastAsia="Microsoft YaHei"/>
-          <w:color w:val="212529"/>
-          <w:sz w:val="22"/>
-        </w:rPr>
-        <w:t>注册完成后，建议先确认后台能看到「余额」「兑换码」和「API Key」等入口。</w:t>
-      </w:r>
-    </w:p>
-    <w:p>
-      <w:pPr>
-        <w:pStyle w:val="Heading1"/>
-        <w:spacing w:before="360" w:after="200" w:line="264" w:lineRule="auto"/>
-      </w:pPr>
-      <w:r>
-        <w:rPr>
-          <w:rFonts w:ascii="Calibri" w:hAnsi="Calibri" w:eastAsia="Microsoft YaHei"/>
-          <w:b/>
-          <w:color w:val="2E74B5"/>
-          <w:sz w:val="32"/>
-        </w:rPr>
-        <w:t>第二步：使用兑换码兑换额度</w:t>
-      </w:r>
-    </w:p>
-    <w:p>
-      <w:pPr>
-        <w:spacing w:before="0" w:after="120" w:line="300" w:lineRule="auto"/>
-      </w:pPr>
-      <w:r>
-        <w:rPr>
-          <w:rFonts w:ascii="Calibri" w:hAnsi="Calibri" w:eastAsia="Microsoft YaHei"/>
-          <w:color w:val="212529"/>
-          <w:sz w:val="22"/>
-        </w:rPr>
-        <w:t>兑换码用于把平台赠送或购买的额度充入你的账号。</w:t>
-      </w:r>
-    </w:p>
-    <w:p>
-      <w:pPr>
-        <w:pStyle w:val="ListNumber"/>
-        <w:spacing w:before="0" w:after="80" w:line="300" w:lineRule="auto"/>
-      </w:pPr>
-      <w:r>
-        <w:rPr>
-          <w:rFonts w:ascii="Calibri" w:hAnsi="Calibri" w:eastAsia="Microsoft YaHei"/>
-          <w:color w:val="212529"/>
-          <w:sz w:val="22"/>
-        </w:rPr>
-        <w:t>登录中转站后台。</w:t>
-      </w:r>
-    </w:p>
-    <w:p>
-      <w:pPr>
-        <w:pStyle w:val="ListNumber"/>
-        <w:spacing w:before="0" w:after="80" w:line="300" w:lineRule="auto"/>
-      </w:pPr>
-      <w:r>
-        <w:rPr>
-          <w:rFonts w:ascii="Calibri" w:hAnsi="Calibri" w:eastAsia="Microsoft YaHei"/>
-          <w:color w:val="212529"/>
-          <w:sz w:val="22"/>
-        </w:rPr>
-        <w:t>找到「兑换码」「礼品码」「充值」「余额」或类似入口。</w:t>
-      </w:r>
-    </w:p>
-    <w:p>
-      <w:pPr>
-        <w:pStyle w:val="ListNumber"/>
-        <w:spacing w:before="0" w:after="80" w:line="300" w:lineRule="auto"/>
-      </w:pPr>
-      <w:r>
-        <w:rPr>
-          <w:rFonts w:ascii="Calibri" w:hAnsi="Calibri" w:eastAsia="Microsoft YaHei"/>
-          <w:color w:val="212529"/>
-          <w:sz w:val="22"/>
-        </w:rPr>
-        <w:t>将兑换码完整复制进去。</w:t>
-      </w:r>
-    </w:p>
-    <w:p>
-      <w:pPr>
-        <w:pStyle w:val="ListNumber"/>
-        <w:spacing w:before="0" w:after="80" w:line="300" w:lineRule="auto"/>
-      </w:pPr>
-      <w:r>
-        <w:rPr>
-          <w:rFonts w:ascii="Calibri" w:hAnsi="Calibri" w:eastAsia="Microsoft YaHei"/>
-          <w:color w:val="212529"/>
-          <w:sz w:val="22"/>
-        </w:rPr>
-        <w:t>点击「兑换」「确认」或「提交」。</w:t>
-      </w:r>
-    </w:p>
-    <w:p>
-      <w:pPr>
-        <w:pStyle w:val="ListNumber"/>
-        <w:spacing w:before="0" w:after="80" w:line="300" w:lineRule="auto"/>
-      </w:pPr>
-      <w:r>
-        <w:rPr>
-          <w:rFonts w:ascii="Calibri" w:hAnsi="Calibri" w:eastAsia="Microsoft YaHei"/>
-          <w:color w:val="212529"/>
-          <w:sz w:val="22"/>
-        </w:rPr>
-        <w:t>回到「余额」或「用量」页面，确认额度是否到账。</w:t>
+        <w:t>面向购买或试用我们中转站服务的客户：按网站实际页面完成注册、购买/兑换、创建 API 密钥，并接入到 Codex CLI、Claude Code、Gemini CLI、OpenCode 或自己的程序。</w:t>
       </w:r>
     </w:p>
     <w:tbl>
@@ -769,7 +86,7 @@
                 <w:color w:val="1F4D78"/>
                 <w:sz w:val="21"/>
               </w:rPr>
-              <w:t>兑换注意事项</w:t>
+              <w:t>这不是通用 API 教程</w:t>
             </w:r>
           </w:p>
           <w:p>
@@ -782,7 +99,7 @@
                 <w:color w:val="212529"/>
                 <w:sz w:val="21"/>
               </w:rPr>
-              <w:t>兑换码可能区分大小写；不要多复制空格；每个兑换码通常只能使用一次。如果提示已使用、已过期或不存在，请截图联系平台客服。</w:t>
+              <w:t>本文按我们网站的实际页面来写：注册 /register，登录 /login，购买 /purchase，兑换 /redeem，API 密钥 /keys，用量 /usage，可用渠道 /available-channels，渠道状态 /monitor。</w:t>
             </w:r>
           </w:p>
         </w:tc>
@@ -805,7 +122,93 @@
           <w:color w:val="2E74B5"/>
           <w:sz w:val="32"/>
         </w:rPr>
-        <w:t>第三步：理解 URL 和 Key</w:t>
+        <w:t>适合谁使用</w:t>
+      </w:r>
+    </w:p>
+    <w:p>
+      <w:pPr>
+        <w:pStyle w:val="ListBullet"/>
+        <w:spacing w:before="0" w:after="80" w:line="300" w:lineRule="auto"/>
+      </w:pPr>
+      <w:r>
+        <w:rPr>
+          <w:rFonts w:ascii="Calibri" w:hAnsi="Calibri" w:eastAsia="Microsoft YaHei"/>
+          <w:color w:val="212529"/>
+          <w:sz w:val="22"/>
+        </w:rPr>
+        <w:t>想在国内网络环境下稳定调用大模型 API 的个人或团队。</w:t>
+      </w:r>
+    </w:p>
+    <w:p>
+      <w:pPr>
+        <w:pStyle w:val="ListBullet"/>
+        <w:spacing w:before="0" w:after="80" w:line="300" w:lineRule="auto"/>
+      </w:pPr>
+      <w:r>
+        <w:rPr>
+          <w:rFonts w:ascii="Calibri" w:hAnsi="Calibri" w:eastAsia="Microsoft YaHei"/>
+          <w:color w:val="212529"/>
+          <w:sz w:val="22"/>
+        </w:rPr>
+        <w:t>想用 OpenAI、ChatGPT-5.5 / GPT-5.5、Claude、Gemini 等模型，但不想自己处理账号、网络和接口维护的人。</w:t>
+      </w:r>
+    </w:p>
+    <w:p>
+      <w:pPr>
+        <w:pStyle w:val="ListBullet"/>
+        <w:spacing w:before="0" w:after="80" w:line="300" w:lineRule="auto"/>
+      </w:pPr>
+      <w:r>
+        <w:rPr>
+          <w:rFonts w:ascii="Calibri" w:hAnsi="Calibri" w:eastAsia="Microsoft YaHei"/>
+          <w:color w:val="212529"/>
+          <w:sz w:val="22"/>
+        </w:rPr>
+        <w:t>想把大模型接入 Cursor、Codex CLI、Claude Code、Gemini CLI、OpenCode、自己的程序或自动化脚本的人。</w:t>
+      </w:r>
+    </w:p>
+    <w:p>
+      <w:pPr>
+        <w:pStyle w:val="ListBullet"/>
+        <w:spacing w:before="0" w:after="80" w:line="300" w:lineRule="auto"/>
+      </w:pPr>
+      <w:r>
+        <w:rPr>
+          <w:rFonts w:ascii="Calibri" w:hAnsi="Calibri" w:eastAsia="Microsoft YaHei"/>
+          <w:color w:val="212529"/>
+          <w:sz w:val="22"/>
+        </w:rPr>
+        <w:t>想用余额、订阅、兑换码和 API Key 管理团队用量的人。</w:t>
+      </w:r>
+    </w:p>
+    <w:p>
+      <w:pPr>
+        <w:pStyle w:val="Heading1"/>
+        <w:spacing w:before="360" w:after="200" w:line="264" w:lineRule="auto"/>
+      </w:pPr>
+      <w:r>
+        <w:rPr>
+          <w:rFonts w:ascii="Calibri" w:hAnsi="Calibri" w:eastAsia="Microsoft YaHei"/>
+          <w:b/>
+          <w:color w:val="2E74B5"/>
+          <w:sz w:val="32"/>
+        </w:rPr>
+        <w:t>我们中转站的优势</w:t>
+      </w:r>
+    </w:p>
+    <w:p>
+      <w:pPr>
+        <w:pStyle w:val="Heading2"/>
+        <w:spacing w:before="280" w:after="140" w:line="264" w:lineRule="auto"/>
+      </w:pPr>
+      <w:r>
+        <w:rPr>
+          <w:rFonts w:ascii="Calibri" w:hAnsi="Calibri" w:eastAsia="Microsoft YaHei"/>
+          <w:b/>
+          <w:color w:val="2E74B5"/>
+          <w:sz w:val="26"/>
+        </w:rPr>
+        <w:t>免 VPN，国内环境也能更省心调用</w:t>
       </w:r>
     </w:p>
     <w:p>
@@ -818,7 +221,176 @@
           <w:color w:val="212529"/>
           <w:sz w:val="22"/>
         </w:rPr>
-        <w:t>调用大模型时，最常用的是两个信息：URL 和 Key。</w:t>
+        <w:t>客户只需要访问我们的网站和 API 地址，请求由中转站转发到上游模型服务，日常调用更省心。</w:t>
+      </w:r>
+    </w:p>
+    <w:p>
+      <w:pPr>
+        <w:pStyle w:val="Heading2"/>
+        <w:spacing w:before="280" w:after="140" w:line="264" w:lineRule="auto"/>
+      </w:pPr>
+      <w:r>
+        <w:rPr>
+          <w:rFonts w:ascii="Calibri" w:hAnsi="Calibri" w:eastAsia="Microsoft YaHei"/>
+          <w:b/>
+          <w:color w:val="2E74B5"/>
+          <w:sz w:val="26"/>
+        </w:rPr>
+        <w:t>一个 API Key，接入多个模型和工具</w:t>
+      </w:r>
+    </w:p>
+    <w:p>
+      <w:pPr>
+        <w:spacing w:before="0" w:after="120" w:line="300" w:lineRule="auto"/>
+      </w:pPr>
+      <w:r>
+        <w:rPr>
+          <w:rFonts w:ascii="Calibri" w:hAnsi="Calibri" w:eastAsia="Microsoft YaHei"/>
+          <w:color w:val="212529"/>
+          <w:sz w:val="22"/>
+        </w:rPr>
+        <w:t>在「API 密钥」页面创建一个 Key 后，就可以根据后台开放的渠道调用不同模型，例如 OpenAI / ChatGPT-5.5、Claude、Gemini、Antigravity 等。</w:t>
+      </w:r>
+    </w:p>
+    <w:p>
+      <w:pPr>
+        <w:pStyle w:val="Heading2"/>
+        <w:spacing w:before="280" w:after="140" w:line="264" w:lineRule="auto"/>
+      </w:pPr>
+      <w:r>
+        <w:rPr>
+          <w:rFonts w:ascii="Calibri" w:hAnsi="Calibri" w:eastAsia="Microsoft YaHei"/>
+          <w:b/>
+          <w:color w:val="2E74B5"/>
+          <w:sz w:val="26"/>
+        </w:rPr>
+        <w:t>不需要自己维护上游账号和服务器</w:t>
+      </w:r>
+    </w:p>
+    <w:p>
+      <w:pPr>
+        <w:spacing w:before="0" w:after="120" w:line="300" w:lineRule="auto"/>
+      </w:pPr>
+      <w:r>
+        <w:rPr>
+          <w:rFonts w:ascii="Calibri" w:hAnsi="Calibri" w:eastAsia="Microsoft YaHei"/>
+          <w:color w:val="212529"/>
+          <w:sz w:val="22"/>
+        </w:rPr>
+        <w:t>我们负责上游账号、调度、计费、负载均衡和接口转发，客户不用从零部署 Sub2API，也不用自己处理服务器运维。</w:t>
+      </w:r>
+    </w:p>
+    <w:p>
+      <w:pPr>
+        <w:pStyle w:val="Heading2"/>
+        <w:spacing w:before="280" w:after="140" w:line="264" w:lineRule="auto"/>
+      </w:pPr>
+      <w:r>
+        <w:rPr>
+          <w:rFonts w:ascii="Calibri" w:hAnsi="Calibri" w:eastAsia="Microsoft YaHei"/>
+          <w:b/>
+          <w:color w:val="2E74B5"/>
+          <w:sz w:val="26"/>
+        </w:rPr>
+        <w:t>用量清楚，可控成本</w:t>
+      </w:r>
+    </w:p>
+    <w:p>
+      <w:pPr>
+        <w:spacing w:before="0" w:after="120" w:line="300" w:lineRule="auto"/>
+      </w:pPr>
+      <w:r>
+        <w:rPr>
+          <w:rFonts w:ascii="Calibri" w:hAnsi="Calibri" w:eastAsia="Microsoft YaHei"/>
+          <w:color w:val="212529"/>
+          <w:sz w:val="22"/>
+        </w:rPr>
+        <w:t>后台可以查看余额、兑换记录、密钥用量、模型用量和订单记录，还能给 Key 设置额度、有效期、IP 限制和速率限制。</w:t>
+      </w:r>
+    </w:p>
+    <w:p>
+      <w:pPr>
+        <w:pStyle w:val="Heading2"/>
+        <w:spacing w:before="280" w:after="140" w:line="264" w:lineRule="auto"/>
+      </w:pPr>
+      <w:r>
+        <w:rPr>
+          <w:rFonts w:ascii="Calibri" w:hAnsi="Calibri" w:eastAsia="Microsoft YaHei"/>
+          <w:b/>
+          <w:color w:val="2E74B5"/>
+          <w:sz w:val="26"/>
+        </w:rPr>
+        <w:t>适合开发者和团队</w:t>
+      </w:r>
+    </w:p>
+    <w:p>
+      <w:pPr>
+        <w:spacing w:before="0" w:after="120" w:line="300" w:lineRule="auto"/>
+      </w:pPr>
+      <w:r>
+        <w:rPr>
+          <w:rFonts w:ascii="Calibri" w:hAnsi="Calibri" w:eastAsia="Microsoft YaHei"/>
+          <w:color w:val="212529"/>
+          <w:sz w:val="22"/>
+        </w:rPr>
+        <w:t>一个账号可以创建多个 API Key，按工具、项目或成员区分，方便排查和管理。</w:t>
+      </w:r>
+    </w:p>
+    <w:p>
+      <w:pPr>
+        <w:pStyle w:val="Heading1"/>
+        <w:spacing w:before="360" w:after="200" w:line="264" w:lineRule="auto"/>
+      </w:pPr>
+      <w:r>
+        <w:rPr>
+          <w:rFonts w:ascii="Calibri" w:hAnsi="Calibri" w:eastAsia="Microsoft YaHei"/>
+          <w:b/>
+          <w:color w:val="2E74B5"/>
+          <w:sz w:val="32"/>
+        </w:rPr>
+        <w:t>第 1 步：打开我们的网站</w:t>
+      </w:r>
+    </w:p>
+    <w:p>
+      <w:pPr>
+        <w:pStyle w:val="ListNumber"/>
+        <w:spacing w:before="0" w:after="80" w:line="300" w:lineRule="auto"/>
+      </w:pPr>
+      <w:r>
+        <w:rPr>
+          <w:rFonts w:ascii="Calibri" w:hAnsi="Calibri" w:eastAsia="Microsoft YaHei"/>
+          <w:color w:val="212529"/>
+          <w:sz w:val="22"/>
+        </w:rPr>
+        <w:t>打开我们提供的中转站网址：https://你的中转站域名</w:t>
+      </w:r>
+    </w:p>
+    <w:p>
+      <w:pPr>
+        <w:pStyle w:val="ListNumber"/>
+        <w:spacing w:before="0" w:after="80" w:line="300" w:lineRule="auto"/>
+      </w:pPr>
+      <w:r>
+        <w:rPr>
+          <w:rFonts w:ascii="Calibri" w:hAnsi="Calibri" w:eastAsia="Microsoft YaHei"/>
+          <w:color w:val="212529"/>
+          <w:sz w:val="22"/>
+        </w:rPr>
+        <w:t>如果还没有账号，进入注册页：https://你的中转站域名/register</w:t>
+      </w:r>
+    </w:p>
+    <w:p>
+      <w:pPr>
+        <w:pStyle w:val="ListNumber"/>
+        <w:spacing w:before="0" w:after="80" w:line="300" w:lineRule="auto"/>
+      </w:pPr>
+      <w:r>
+        <w:rPr>
+          <w:rFonts w:ascii="Calibri" w:hAnsi="Calibri" w:eastAsia="Microsoft YaHei"/>
+          <w:color w:val="212529"/>
+          <w:sz w:val="22"/>
+        </w:rPr>
+        <w:t>如果已有账号，进入登录页：https://你的中转站域名/login</w:t>
       </w:r>
     </w:p>
     <w:tbl>
@@ -838,9 +410,9 @@
         </w:tblBorders>
       </w:tblPr>
       <w:tblGrid>
-        <w:gridCol w:w="2300"/>
-        <w:gridCol w:w="3900"/>
-        <w:gridCol w:w="3160"/>
+        <w:gridCol w:w="1800"/>
+        <w:gridCol w:w="2600"/>
+        <w:gridCol w:w="4960"/>
       </w:tblGrid>
       <w:tr>
         <w:trPr>
@@ -848,7 +420,7 @@
         </w:trPr>
         <w:tc>
           <w:tcPr>
-            <w:tcW w:type="dxa" w:w="2300"/>
+            <w:tcW w:type="dxa" w:w="1800"/>
             <w:vAlign w:val="center"/>
             <w:tcMar>
               <w:top w:w="100" w:type="dxa"/>
@@ -856,7 +428,7 @@
               <w:bottom w:w="100" w:type="dxa"/>
               <w:end w:w="140" w:type="dxa"/>
             </w:tcMar>
-            <w:shd w:fill="E8EEF5"/>
+            <w:shd w:fill="F2F4F7"/>
           </w:tcPr>
           <w:p>
             <w:pPr>
@@ -869,13 +441,13 @@
                 <w:color w:val="212529"/>
                 <w:sz w:val="21"/>
               </w:rPr>
-              <w:t>名称</w:t>
+              <w:t>页面</w:t>
             </w:r>
           </w:p>
         </w:tc>
         <w:tc>
           <w:tcPr>
-            <w:tcW w:type="dxa" w:w="3900"/>
+            <w:tcW w:type="dxa" w:w="2600"/>
             <w:vAlign w:val="center"/>
             <w:tcMar>
               <w:top w:w="100" w:type="dxa"/>
@@ -883,7 +455,7 @@
               <w:bottom w:w="100" w:type="dxa"/>
               <w:end w:w="140" w:type="dxa"/>
             </w:tcMar>
-            <w:shd w:fill="E8EEF5"/>
+            <w:shd w:fill="F2F4F7"/>
           </w:tcPr>
           <w:p>
             <w:pPr>
@@ -896,13 +468,13 @@
                 <w:color w:val="212529"/>
                 <w:sz w:val="21"/>
               </w:rPr>
-              <w:t>你需要填写什么</w:t>
+              <w:t>地址</w:t>
             </w:r>
           </w:p>
         </w:tc>
         <w:tc>
           <w:tcPr>
-            <w:tcW w:type="dxa" w:w="3160"/>
+            <w:tcW w:type="dxa" w:w="4960"/>
             <w:vAlign w:val="center"/>
             <w:tcMar>
               <w:top w:w="100" w:type="dxa"/>
@@ -910,7 +482,7 @@
               <w:bottom w:w="100" w:type="dxa"/>
               <w:end w:w="140" w:type="dxa"/>
             </w:tcMar>
-            <w:shd w:fill="E8EEF5"/>
+            <w:shd w:fill="F2F4F7"/>
           </w:tcPr>
           <w:p>
             <w:pPr>
@@ -923,7 +495,7 @@
                 <w:color w:val="212529"/>
                 <w:sz w:val="21"/>
               </w:rPr>
-              <w:t>作用</w:t>
+              <w:t>用途</w:t>
             </w:r>
           </w:p>
         </w:tc>
@@ -931,7 +503,7 @@
       <w:tr>
         <w:tc>
           <w:tcPr>
-            <w:tcW w:type="dxa" w:w="2300"/>
+            <w:tcW w:type="dxa" w:w="1800"/>
             <w:vAlign w:val="center"/>
             <w:tcMar>
               <w:top w:w="100" w:type="dxa"/>
@@ -950,13 +522,13 @@
                 <w:color w:val="212529"/>
                 <w:sz w:val="21"/>
               </w:rPr>
-              <w:t>API URL / Base URL</w:t>
+              <w:t>控制台</w:t>
             </w:r>
           </w:p>
         </w:tc>
         <w:tc>
           <w:tcPr>
-            <w:tcW w:type="dxa" w:w="3900"/>
+            <w:tcW w:type="dxa" w:w="2600"/>
             <w:vAlign w:val="center"/>
             <w:tcMar>
               <w:top w:w="100" w:type="dxa"/>
@@ -975,13 +547,13 @@
                 <w:color w:val="212529"/>
                 <w:sz w:val="21"/>
               </w:rPr>
-              <w:t>通常类似 https://你的中转站域名/v1</w:t>
+              <w:t>/dashboard</w:t>
             </w:r>
           </w:p>
         </w:tc>
         <w:tc>
           <w:tcPr>
-            <w:tcW w:type="dxa" w:w="3160"/>
+            <w:tcW w:type="dxa" w:w="4960"/>
             <w:vAlign w:val="center"/>
             <w:tcMar>
               <w:top w:w="100" w:type="dxa"/>
@@ -1000,7 +572,7 @@
                 <w:color w:val="212529"/>
                 <w:sz w:val="21"/>
               </w:rPr>
-              <w:t>告诉工具把请求发到哪里</w:t>
+              <w:t>查看账户概览和快捷入口</w:t>
             </w:r>
           </w:p>
         </w:tc>
@@ -1008,7 +580,7 @@
       <w:tr>
         <w:tc>
           <w:tcPr>
-            <w:tcW w:type="dxa" w:w="2300"/>
+            <w:tcW w:type="dxa" w:w="1800"/>
             <w:vAlign w:val="center"/>
             <w:tcMar>
               <w:top w:w="100" w:type="dxa"/>
@@ -1027,13 +599,13 @@
                 <w:color w:val="212529"/>
                 <w:sz w:val="21"/>
               </w:rPr>
-              <w:t>API Key / Token / 密钥</w:t>
+              <w:t>API 密钥</w:t>
             </w:r>
           </w:p>
         </w:tc>
         <w:tc>
           <w:tcPr>
-            <w:tcW w:type="dxa" w:w="3900"/>
+            <w:tcW w:type="dxa" w:w="2600"/>
             <w:vAlign w:val="center"/>
             <w:tcMar>
               <w:top w:w="100" w:type="dxa"/>
@@ -1052,13 +624,13 @@
                 <w:color w:val="212529"/>
                 <w:sz w:val="21"/>
               </w:rPr>
-              <w:t>通常类似 sk-xxxxxxxx</w:t>
+              <w:t>/keys</w:t>
             </w:r>
           </w:p>
         </w:tc>
         <w:tc>
           <w:tcPr>
-            <w:tcW w:type="dxa" w:w="3160"/>
+            <w:tcW w:type="dxa" w:w="4960"/>
             <w:vAlign w:val="center"/>
             <w:tcMar>
               <w:top w:w="100" w:type="dxa"/>
@@ -1077,7 +649,7 @@
                 <w:color w:val="212529"/>
                 <w:sz w:val="21"/>
               </w:rPr>
-              <w:t>证明这次请求属于你的账号</w:t>
+              <w:t>创建、复制、管理 API Key</w:t>
             </w:r>
           </w:p>
         </w:tc>
@@ -1085,7 +657,7 @@
       <w:tr>
         <w:tc>
           <w:tcPr>
-            <w:tcW w:type="dxa" w:w="2300"/>
+            <w:tcW w:type="dxa" w:w="1800"/>
             <w:vAlign w:val="center"/>
             <w:tcMar>
               <w:top w:w="100" w:type="dxa"/>
@@ -1104,13 +676,13 @@
                 <w:color w:val="212529"/>
                 <w:sz w:val="21"/>
               </w:rPr>
-              <w:t>Model / 模型</w:t>
+              <w:t>用量记录</w:t>
             </w:r>
           </w:p>
         </w:tc>
         <w:tc>
           <w:tcPr>
-            <w:tcW w:type="dxa" w:w="3900"/>
+            <w:tcW w:type="dxa" w:w="2600"/>
             <w:vAlign w:val="center"/>
             <w:tcMar>
               <w:top w:w="100" w:type="dxa"/>
@@ -1129,13 +701,13 @@
                 <w:color w:val="212529"/>
                 <w:sz w:val="21"/>
               </w:rPr>
-              <w:t>例如 gpt-5.5，或后台模型列表里的其他模型</w:t>
+              <w:t>/usage</w:t>
             </w:r>
           </w:p>
         </w:tc>
         <w:tc>
           <w:tcPr>
-            <w:tcW w:type="dxa" w:w="3160"/>
+            <w:tcW w:type="dxa" w:w="4960"/>
             <w:vAlign w:val="center"/>
             <w:tcMar>
               <w:top w:w="100" w:type="dxa"/>
@@ -1154,7 +726,392 @@
                 <w:color w:val="212529"/>
                 <w:sz w:val="21"/>
               </w:rPr>
-              <w:t>告诉平台你想调用哪个模型</w:t>
+              <w:t>查看请求、模型和费用明细</w:t>
+            </w:r>
+          </w:p>
+        </w:tc>
+      </w:tr>
+      <w:tr>
+        <w:tc>
+          <w:tcPr>
+            <w:tcW w:type="dxa" w:w="1800"/>
+            <w:vAlign w:val="center"/>
+            <w:tcMar>
+              <w:top w:w="100" w:type="dxa"/>
+              <w:start w:w="140" w:type="dxa"/>
+              <w:bottom w:w="100" w:type="dxa"/>
+              <w:end w:w="140" w:type="dxa"/>
+            </w:tcMar>
+          </w:tcPr>
+          <w:p>
+            <w:pPr>
+              <w:spacing w:before="0" w:after="0" w:line="276" w:lineRule="auto"/>
+            </w:pPr>
+            <w:r>
+              <w:rPr>
+                <w:rFonts w:ascii="Calibri" w:hAnsi="Calibri" w:eastAsia="Microsoft YaHei"/>
+                <w:color w:val="212529"/>
+                <w:sz w:val="21"/>
+              </w:rPr>
+              <w:t>可用渠道</w:t>
+            </w:r>
+          </w:p>
+        </w:tc>
+        <w:tc>
+          <w:tcPr>
+            <w:tcW w:type="dxa" w:w="2600"/>
+            <w:vAlign w:val="center"/>
+            <w:tcMar>
+              <w:top w:w="100" w:type="dxa"/>
+              <w:start w:w="140" w:type="dxa"/>
+              <w:bottom w:w="100" w:type="dxa"/>
+              <w:end w:w="140" w:type="dxa"/>
+            </w:tcMar>
+          </w:tcPr>
+          <w:p>
+            <w:pPr>
+              <w:spacing w:before="0" w:after="0" w:line="276" w:lineRule="auto"/>
+            </w:pPr>
+            <w:r>
+              <w:rPr>
+                <w:rFonts w:ascii="Calibri" w:hAnsi="Calibri" w:eastAsia="Microsoft YaHei"/>
+                <w:color w:val="212529"/>
+                <w:sz w:val="21"/>
+              </w:rPr>
+              <w:t>/available-channels</w:t>
+            </w:r>
+          </w:p>
+        </w:tc>
+        <w:tc>
+          <w:tcPr>
+            <w:tcW w:type="dxa" w:w="4960"/>
+            <w:vAlign w:val="center"/>
+            <w:tcMar>
+              <w:top w:w="100" w:type="dxa"/>
+              <w:start w:w="140" w:type="dxa"/>
+              <w:bottom w:w="100" w:type="dxa"/>
+              <w:end w:w="140" w:type="dxa"/>
+            </w:tcMar>
+          </w:tcPr>
+          <w:p>
+            <w:pPr>
+              <w:spacing w:before="0" w:after="0" w:line="276" w:lineRule="auto"/>
+            </w:pPr>
+            <w:r>
+              <w:rPr>
+                <w:rFonts w:ascii="Calibri" w:hAnsi="Calibri" w:eastAsia="Microsoft YaHei"/>
+                <w:color w:val="212529"/>
+                <w:sz w:val="21"/>
+              </w:rPr>
+              <w:t>查看当前开放的模型渠道</w:t>
+            </w:r>
+          </w:p>
+        </w:tc>
+      </w:tr>
+      <w:tr>
+        <w:tc>
+          <w:tcPr>
+            <w:tcW w:type="dxa" w:w="1800"/>
+            <w:vAlign w:val="center"/>
+            <w:tcMar>
+              <w:top w:w="100" w:type="dxa"/>
+              <w:start w:w="140" w:type="dxa"/>
+              <w:bottom w:w="100" w:type="dxa"/>
+              <w:end w:w="140" w:type="dxa"/>
+            </w:tcMar>
+          </w:tcPr>
+          <w:p>
+            <w:pPr>
+              <w:spacing w:before="0" w:after="0" w:line="276" w:lineRule="auto"/>
+            </w:pPr>
+            <w:r>
+              <w:rPr>
+                <w:rFonts w:ascii="Calibri" w:hAnsi="Calibri" w:eastAsia="Microsoft YaHei"/>
+                <w:color w:val="212529"/>
+                <w:sz w:val="21"/>
+              </w:rPr>
+              <w:t>渠道状态</w:t>
+            </w:r>
+          </w:p>
+        </w:tc>
+        <w:tc>
+          <w:tcPr>
+            <w:tcW w:type="dxa" w:w="2600"/>
+            <w:vAlign w:val="center"/>
+            <w:tcMar>
+              <w:top w:w="100" w:type="dxa"/>
+              <w:start w:w="140" w:type="dxa"/>
+              <w:bottom w:w="100" w:type="dxa"/>
+              <w:end w:w="140" w:type="dxa"/>
+            </w:tcMar>
+          </w:tcPr>
+          <w:p>
+            <w:pPr>
+              <w:spacing w:before="0" w:after="0" w:line="276" w:lineRule="auto"/>
+            </w:pPr>
+            <w:r>
+              <w:rPr>
+                <w:rFonts w:ascii="Calibri" w:hAnsi="Calibri" w:eastAsia="Microsoft YaHei"/>
+                <w:color w:val="212529"/>
+                <w:sz w:val="21"/>
+              </w:rPr>
+              <w:t>/monitor</w:t>
+            </w:r>
+          </w:p>
+        </w:tc>
+        <w:tc>
+          <w:tcPr>
+            <w:tcW w:type="dxa" w:w="4960"/>
+            <w:vAlign w:val="center"/>
+            <w:tcMar>
+              <w:top w:w="100" w:type="dxa"/>
+              <w:start w:w="140" w:type="dxa"/>
+              <w:bottom w:w="100" w:type="dxa"/>
+              <w:end w:w="140" w:type="dxa"/>
+            </w:tcMar>
+          </w:tcPr>
+          <w:p>
+            <w:pPr>
+              <w:spacing w:before="0" w:after="0" w:line="276" w:lineRule="auto"/>
+            </w:pPr>
+            <w:r>
+              <w:rPr>
+                <w:rFonts w:ascii="Calibri" w:hAnsi="Calibri" w:eastAsia="Microsoft YaHei"/>
+                <w:color w:val="212529"/>
+                <w:sz w:val="21"/>
+              </w:rPr>
+              <w:t>查看渠道可用性和延迟</w:t>
+            </w:r>
+          </w:p>
+        </w:tc>
+      </w:tr>
+      <w:tr>
+        <w:tc>
+          <w:tcPr>
+            <w:tcW w:type="dxa" w:w="1800"/>
+            <w:vAlign w:val="center"/>
+            <w:tcMar>
+              <w:top w:w="100" w:type="dxa"/>
+              <w:start w:w="140" w:type="dxa"/>
+              <w:bottom w:w="100" w:type="dxa"/>
+              <w:end w:w="140" w:type="dxa"/>
+            </w:tcMar>
+          </w:tcPr>
+          <w:p>
+            <w:pPr>
+              <w:spacing w:before="0" w:after="0" w:line="276" w:lineRule="auto"/>
+            </w:pPr>
+            <w:r>
+              <w:rPr>
+                <w:rFonts w:ascii="Calibri" w:hAnsi="Calibri" w:eastAsia="Microsoft YaHei"/>
+                <w:color w:val="212529"/>
+                <w:sz w:val="21"/>
+              </w:rPr>
+              <w:t>充值/订阅</w:t>
+            </w:r>
+          </w:p>
+        </w:tc>
+        <w:tc>
+          <w:tcPr>
+            <w:tcW w:type="dxa" w:w="2600"/>
+            <w:vAlign w:val="center"/>
+            <w:tcMar>
+              <w:top w:w="100" w:type="dxa"/>
+              <w:start w:w="140" w:type="dxa"/>
+              <w:bottom w:w="100" w:type="dxa"/>
+              <w:end w:w="140" w:type="dxa"/>
+            </w:tcMar>
+          </w:tcPr>
+          <w:p>
+            <w:pPr>
+              <w:spacing w:before="0" w:after="0" w:line="276" w:lineRule="auto"/>
+            </w:pPr>
+            <w:r>
+              <w:rPr>
+                <w:rFonts w:ascii="Calibri" w:hAnsi="Calibri" w:eastAsia="Microsoft YaHei"/>
+                <w:color w:val="212529"/>
+                <w:sz w:val="21"/>
+              </w:rPr>
+              <w:t>/purchase</w:t>
+            </w:r>
+          </w:p>
+        </w:tc>
+        <w:tc>
+          <w:tcPr>
+            <w:tcW w:type="dxa" w:w="4960"/>
+            <w:vAlign w:val="center"/>
+            <w:tcMar>
+              <w:top w:w="100" w:type="dxa"/>
+              <w:start w:w="140" w:type="dxa"/>
+              <w:bottom w:w="100" w:type="dxa"/>
+              <w:end w:w="140" w:type="dxa"/>
+            </w:tcMar>
+          </w:tcPr>
+          <w:p>
+            <w:pPr>
+              <w:spacing w:before="0" w:after="0" w:line="276" w:lineRule="auto"/>
+            </w:pPr>
+            <w:r>
+              <w:rPr>
+                <w:rFonts w:ascii="Calibri" w:hAnsi="Calibri" w:eastAsia="Microsoft YaHei"/>
+                <w:color w:val="212529"/>
+                <w:sz w:val="21"/>
+              </w:rPr>
+              <w:t>购买余额或订阅套餐</w:t>
+            </w:r>
+          </w:p>
+        </w:tc>
+      </w:tr>
+      <w:tr>
+        <w:tc>
+          <w:tcPr>
+            <w:tcW w:type="dxa" w:w="1800"/>
+            <w:vAlign w:val="center"/>
+            <w:tcMar>
+              <w:top w:w="100" w:type="dxa"/>
+              <w:start w:w="140" w:type="dxa"/>
+              <w:bottom w:w="100" w:type="dxa"/>
+              <w:end w:w="140" w:type="dxa"/>
+            </w:tcMar>
+          </w:tcPr>
+          <w:p>
+            <w:pPr>
+              <w:spacing w:before="0" w:after="0" w:line="276" w:lineRule="auto"/>
+            </w:pPr>
+            <w:r>
+              <w:rPr>
+                <w:rFonts w:ascii="Calibri" w:hAnsi="Calibri" w:eastAsia="Microsoft YaHei"/>
+                <w:color w:val="212529"/>
+                <w:sz w:val="21"/>
+              </w:rPr>
+              <w:t>兑换码</w:t>
+            </w:r>
+          </w:p>
+        </w:tc>
+        <w:tc>
+          <w:tcPr>
+            <w:tcW w:type="dxa" w:w="2600"/>
+            <w:vAlign w:val="center"/>
+            <w:tcMar>
+              <w:top w:w="100" w:type="dxa"/>
+              <w:start w:w="140" w:type="dxa"/>
+              <w:bottom w:w="100" w:type="dxa"/>
+              <w:end w:w="140" w:type="dxa"/>
+            </w:tcMar>
+          </w:tcPr>
+          <w:p>
+            <w:pPr>
+              <w:spacing w:before="0" w:after="0" w:line="276" w:lineRule="auto"/>
+            </w:pPr>
+            <w:r>
+              <w:rPr>
+                <w:rFonts w:ascii="Calibri" w:hAnsi="Calibri" w:eastAsia="Microsoft YaHei"/>
+                <w:color w:val="212529"/>
+                <w:sz w:val="21"/>
+              </w:rPr>
+              <w:t>/redeem</w:t>
+            </w:r>
+          </w:p>
+        </w:tc>
+        <w:tc>
+          <w:tcPr>
+            <w:tcW w:type="dxa" w:w="4960"/>
+            <w:vAlign w:val="center"/>
+            <w:tcMar>
+              <w:top w:w="100" w:type="dxa"/>
+              <w:start w:w="140" w:type="dxa"/>
+              <w:bottom w:w="100" w:type="dxa"/>
+              <w:end w:w="140" w:type="dxa"/>
+            </w:tcMar>
+          </w:tcPr>
+          <w:p>
+            <w:pPr>
+              <w:spacing w:before="0" w:after="0" w:line="276" w:lineRule="auto"/>
+            </w:pPr>
+            <w:r>
+              <w:rPr>
+                <w:rFonts w:ascii="Calibri" w:hAnsi="Calibri" w:eastAsia="Microsoft YaHei"/>
+                <w:color w:val="212529"/>
+                <w:sz w:val="21"/>
+              </w:rPr>
+              <w:t>使用兑换码兑换余额、并发或试用权限</w:t>
+            </w:r>
+          </w:p>
+        </w:tc>
+      </w:tr>
+      <w:tr>
+        <w:tc>
+          <w:tcPr>
+            <w:tcW w:type="dxa" w:w="1800"/>
+            <w:vAlign w:val="center"/>
+            <w:tcMar>
+              <w:top w:w="100" w:type="dxa"/>
+              <w:start w:w="140" w:type="dxa"/>
+              <w:bottom w:w="100" w:type="dxa"/>
+              <w:end w:w="140" w:type="dxa"/>
+            </w:tcMar>
+          </w:tcPr>
+          <w:p>
+            <w:pPr>
+              <w:spacing w:before="0" w:after="0" w:line="276" w:lineRule="auto"/>
+            </w:pPr>
+            <w:r>
+              <w:rPr>
+                <w:rFonts w:ascii="Calibri" w:hAnsi="Calibri" w:eastAsia="Microsoft YaHei"/>
+                <w:color w:val="212529"/>
+                <w:sz w:val="21"/>
+              </w:rPr>
+              <w:t>我的订单</w:t>
+            </w:r>
+          </w:p>
+        </w:tc>
+        <w:tc>
+          <w:tcPr>
+            <w:tcW w:type="dxa" w:w="2600"/>
+            <w:vAlign w:val="center"/>
+            <w:tcMar>
+              <w:top w:w="100" w:type="dxa"/>
+              <w:start w:w="140" w:type="dxa"/>
+              <w:bottom w:w="100" w:type="dxa"/>
+              <w:end w:w="140" w:type="dxa"/>
+            </w:tcMar>
+          </w:tcPr>
+          <w:p>
+            <w:pPr>
+              <w:spacing w:before="0" w:after="0" w:line="276" w:lineRule="auto"/>
+            </w:pPr>
+            <w:r>
+              <w:rPr>
+                <w:rFonts w:ascii="Calibri" w:hAnsi="Calibri" w:eastAsia="Microsoft YaHei"/>
+                <w:color w:val="212529"/>
+                <w:sz w:val="21"/>
+              </w:rPr>
+              <w:t>/orders</w:t>
+            </w:r>
+          </w:p>
+        </w:tc>
+        <w:tc>
+          <w:tcPr>
+            <w:tcW w:type="dxa" w:w="4960"/>
+            <w:vAlign w:val="center"/>
+            <w:tcMar>
+              <w:top w:w="100" w:type="dxa"/>
+              <w:start w:w="140" w:type="dxa"/>
+              <w:bottom w:w="100" w:type="dxa"/>
+              <w:end w:w="140" w:type="dxa"/>
+            </w:tcMar>
+          </w:tcPr>
+          <w:p>
+            <w:pPr>
+              <w:spacing w:before="0" w:after="0" w:line="276" w:lineRule="auto"/>
+            </w:pPr>
+            <w:r>
+              <w:rPr>
+                <w:rFonts w:ascii="Calibri" w:hAnsi="Calibri" w:eastAsia="Microsoft YaHei"/>
+                <w:color w:val="212529"/>
+                <w:sz w:val="21"/>
+              </w:rPr>
+              <w:t>查看充值和订阅订单</w:t>
             </w:r>
           </w:p>
         </w:tc>
@@ -1167,7 +1124,22 @@
     </w:p>
     <w:p>
       <w:pPr>
-        <w:pStyle w:val="ListBullet"/>
+        <w:pStyle w:val="Heading1"/>
+        <w:spacing w:before="360" w:after="200" w:line="264" w:lineRule="auto"/>
+      </w:pPr>
+      <w:r>
+        <w:rPr>
+          <w:rFonts w:ascii="Calibri" w:hAnsi="Calibri" w:eastAsia="Microsoft YaHei"/>
+          <w:b/>
+          <w:color w:val="2E74B5"/>
+          <w:sz w:val="32"/>
+        </w:rPr>
+        <w:t>第 2 步：注册账号</w:t>
+      </w:r>
+    </w:p>
+    <w:p>
+      <w:pPr>
+        <w:pStyle w:val="ListNumber"/>
         <w:spacing w:before="0" w:after="80" w:line="300" w:lineRule="auto"/>
       </w:pPr>
       <w:r>
@@ -1176,12 +1148,12 @@
           <w:color w:val="212529"/>
           <w:sz w:val="22"/>
         </w:rPr>
-        <w:t>不要把 API Key 发到微信群、论坛、公开代码仓库或截图里。</w:t>
+        <w:t>进入 /register 页面。</w:t>
       </w:r>
     </w:p>
     <w:p>
       <w:pPr>
-        <w:pStyle w:val="ListBullet"/>
+        <w:pStyle w:val="ListNumber"/>
         <w:spacing w:before="0" w:after="80" w:line="300" w:lineRule="auto"/>
       </w:pPr>
       <w:r>
@@ -1190,12 +1162,12 @@
           <w:color w:val="212529"/>
           <w:sz w:val="22"/>
         </w:rPr>
-        <w:t>如果怀疑 Key 泄露，立刻在后台删除旧 Key，并创建新 Key。</w:t>
+        <w:t>输入邮箱并设置密码。</w:t>
       </w:r>
     </w:p>
     <w:p>
       <w:pPr>
-        <w:pStyle w:val="ListBullet"/>
+        <w:pStyle w:val="ListNumber"/>
         <w:spacing w:before="0" w:after="80" w:line="300" w:lineRule="auto"/>
       </w:pPr>
       <w:r>
@@ -1204,7 +1176,49 @@
           <w:color w:val="212529"/>
           <w:sz w:val="22"/>
         </w:rPr>
-        <w:t>团队多人使用时，建议给不同成员或工具创建不同 Key。</w:t>
+        <w:t>如果页面显示邀请码，请填写我们提供的邀请码。</w:t>
+      </w:r>
+    </w:p>
+    <w:p>
+      <w:pPr>
+        <w:pStyle w:val="ListNumber"/>
+        <w:spacing w:before="0" w:after="80" w:line="300" w:lineRule="auto"/>
+      </w:pPr>
+      <w:r>
+        <w:rPr>
+          <w:rFonts w:ascii="Calibri" w:hAnsi="Calibri" w:eastAsia="Microsoft YaHei"/>
+          <w:color w:val="212529"/>
+          <w:sz w:val="22"/>
+        </w:rPr>
+        <w:t>如果页面显示优惠码，可填写我们提供的优惠码，享受活动赠送额度。</w:t>
+      </w:r>
+    </w:p>
+    <w:p>
+      <w:pPr>
+        <w:pStyle w:val="ListNumber"/>
+        <w:spacing w:before="0" w:after="80" w:line="300" w:lineRule="auto"/>
+      </w:pPr>
+      <w:r>
+        <w:rPr>
+          <w:rFonts w:ascii="Calibri" w:hAnsi="Calibri" w:eastAsia="Microsoft YaHei"/>
+          <w:color w:val="212529"/>
+          <w:sz w:val="22"/>
+        </w:rPr>
+        <w:t>如果页面要求验证，请完成邮箱验证或人机验证。</w:t>
+      </w:r>
+    </w:p>
+    <w:p>
+      <w:pPr>
+        <w:pStyle w:val="ListNumber"/>
+        <w:spacing w:before="0" w:after="80" w:line="300" w:lineRule="auto"/>
+      </w:pPr>
+      <w:r>
+        <w:rPr>
+          <w:rFonts w:ascii="Calibri" w:hAnsi="Calibri" w:eastAsia="Microsoft YaHei"/>
+          <w:color w:val="212529"/>
+          <w:sz w:val="22"/>
+        </w:rPr>
+        <w:t>点击「创建账号」。注册成功后进入控制台。</w:t>
       </w:r>
     </w:p>
     <w:p>
@@ -1219,7 +1233,22 @@
           <w:color w:val="2E74B5"/>
           <w:sz w:val="32"/>
         </w:rPr>
-        <w:t>第四步：创建并复制 API Key</w:t>
+        <w:t>第 3 步：购买套餐或兑换额度</w:t>
+      </w:r>
+    </w:p>
+    <w:p>
+      <w:pPr>
+        <w:pStyle w:val="Heading2"/>
+        <w:spacing w:before="280" w:after="140" w:line="264" w:lineRule="auto"/>
+      </w:pPr>
+      <w:r>
+        <w:rPr>
+          <w:rFonts w:ascii="Calibri" w:hAnsi="Calibri" w:eastAsia="Microsoft YaHei"/>
+          <w:b/>
+          <w:color w:val="2E74B5"/>
+          <w:sz w:val="26"/>
+        </w:rPr>
+        <w:t>方式 A：在线购买</w:t>
       </w:r>
     </w:p>
     <w:p>
@@ -1233,7 +1262,7 @@
           <w:color w:val="212529"/>
           <w:sz w:val="22"/>
         </w:rPr>
-        <w:t>进入「API Key」「令牌」「密钥」或「开发者」页面。</w:t>
+        <w:t>进入 /purchase 页面。</w:t>
       </w:r>
     </w:p>
     <w:p>
@@ -1247,7 +1276,7 @@
           <w:color w:val="212529"/>
           <w:sz w:val="22"/>
         </w:rPr>
-        <w:t>点击「创建 Key」「新建密钥」或类似按钮。</w:t>
+        <w:t>选择「充值」或「订阅」。</w:t>
       </w:r>
     </w:p>
     <w:p>
@@ -1261,7 +1290,7 @@
           <w:color w:val="212529"/>
           <w:sz w:val="22"/>
         </w:rPr>
-        <w:t>给 Key 起一个容易识别的名字，例如 my-laptop、cursor-work 或 server-test。</w:t>
+        <w:t>如果是充值，输入充值金额；如果是订阅，选择适合你的模型渠道或套餐。</w:t>
       </w:r>
     </w:p>
     <w:p>
@@ -1275,7 +1304,7 @@
           <w:color w:val="212529"/>
           <w:sz w:val="22"/>
         </w:rPr>
-        <w:t>复制新生成的 API Key，并保存到安全位置。</w:t>
+        <w:t>选择支付方式，创建订单并完成支付。</w:t>
       </w:r>
     </w:p>
     <w:p>
@@ -1289,8 +1318,160 @@
           <w:color w:val="212529"/>
           <w:sz w:val="22"/>
         </w:rPr>
-        <w:t>如果后台只在创建时显示一次 Key，请务必当场复制保存。</w:t>
+        <w:t>支付完成后，到 /orders 或控制台确认到账。</w:t>
       </w:r>
+    </w:p>
+    <w:p>
+      <w:pPr>
+        <w:pStyle w:val="Heading2"/>
+        <w:spacing w:before="280" w:after="140" w:line="264" w:lineRule="auto"/>
+      </w:pPr>
+      <w:r>
+        <w:rPr>
+          <w:rFonts w:ascii="Calibri" w:hAnsi="Calibri" w:eastAsia="Microsoft YaHei"/>
+          <w:b/>
+          <w:color w:val="2E74B5"/>
+          <w:sz w:val="26"/>
+        </w:rPr>
+        <w:t>方式 B：使用兑换码</w:t>
+      </w:r>
+    </w:p>
+    <w:p>
+      <w:pPr>
+        <w:pStyle w:val="ListNumber"/>
+        <w:spacing w:before="0" w:after="80" w:line="300" w:lineRule="auto"/>
+      </w:pPr>
+      <w:r>
+        <w:rPr>
+          <w:rFonts w:ascii="Calibri" w:hAnsi="Calibri" w:eastAsia="Microsoft YaHei"/>
+          <w:color w:val="212529"/>
+          <w:sz w:val="22"/>
+        </w:rPr>
+        <w:t>进入 /redeem 页面。</w:t>
+      </w:r>
+    </w:p>
+    <w:p>
+      <w:pPr>
+        <w:pStyle w:val="ListNumber"/>
+        <w:spacing w:before="0" w:after="80" w:line="300" w:lineRule="auto"/>
+      </w:pPr>
+      <w:r>
+        <w:rPr>
+          <w:rFonts w:ascii="Calibri" w:hAnsi="Calibri" w:eastAsia="Microsoft YaHei"/>
+          <w:color w:val="212529"/>
+          <w:sz w:val="22"/>
+        </w:rPr>
+        <w:t>查看页面顶部的当前余额和并发数。</w:t>
+      </w:r>
+    </w:p>
+    <w:p>
+      <w:pPr>
+        <w:pStyle w:val="ListNumber"/>
+        <w:spacing w:before="0" w:after="80" w:line="300" w:lineRule="auto"/>
+      </w:pPr>
+      <w:r>
+        <w:rPr>
+          <w:rFonts w:ascii="Calibri" w:hAnsi="Calibri" w:eastAsia="Microsoft YaHei"/>
+          <w:color w:val="212529"/>
+          <w:sz w:val="22"/>
+        </w:rPr>
+        <w:t>在「兑换码」输入框粘贴兑换码。</w:t>
+      </w:r>
+    </w:p>
+    <w:p>
+      <w:pPr>
+        <w:pStyle w:val="ListNumber"/>
+        <w:spacing w:before="0" w:after="80" w:line="300" w:lineRule="auto"/>
+      </w:pPr>
+      <w:r>
+        <w:rPr>
+          <w:rFonts w:ascii="Calibri" w:hAnsi="Calibri" w:eastAsia="Microsoft YaHei"/>
+          <w:color w:val="212529"/>
+          <w:sz w:val="22"/>
+        </w:rPr>
+        <w:t>点击「兑换」。</w:t>
+      </w:r>
+    </w:p>
+    <w:p>
+      <w:pPr>
+        <w:pStyle w:val="ListNumber"/>
+        <w:spacing w:before="0" w:after="80" w:line="300" w:lineRule="auto"/>
+      </w:pPr>
+      <w:r>
+        <w:rPr>
+          <w:rFonts w:ascii="Calibri" w:hAnsi="Calibri" w:eastAsia="Microsoft YaHei"/>
+          <w:color w:val="212529"/>
+          <w:sz w:val="22"/>
+        </w:rPr>
+        <w:t>页面显示「兑换成功」后，确认新余额、新并发或订阅权限。</w:t>
+      </w:r>
+    </w:p>
+    <w:tbl>
+      <w:tblPr>
+        <w:tblW w:type="dxa" w:w="9360"/>
+        <w:jc w:val="left"/>
+        <w:tblLayout w:type="fixed"/>
+        <w:tblLook w:firstColumn="1" w:firstRow="1" w:lastColumn="0" w:lastRow="0" w:noHBand="0" w:noVBand="1" w:val="04A0"/>
+        <w:tblInd w:w="120" w:type="dxa"/>
+        <w:tblBorders>
+          <w:top w:val="single" w:sz="4" w:space="0" w:color="E2E7EE"/>
+          <w:left w:val="single" w:sz="4" w:space="0" w:color="E2E7EE"/>
+          <w:bottom w:val="single" w:sz="4" w:space="0" w:color="E2E7EE"/>
+          <w:right w:val="single" w:sz="4" w:space="0" w:color="E2E7EE"/>
+          <w:insideH w:val="single" w:sz="4" w:space="0" w:color="E2E7EE"/>
+          <w:insideV w:val="single" w:sz="4" w:space="0" w:color="E2E7EE"/>
+        </w:tblBorders>
+      </w:tblPr>
+      <w:tblGrid>
+        <w:gridCol w:w="9360"/>
+      </w:tblGrid>
+      <w:tr>
+        <w:tc>
+          <w:tcPr>
+            <w:tcW w:type="dxa" w:w="9360"/>
+            <w:vAlign w:val="center"/>
+            <w:tcMar>
+              <w:top w:w="100" w:type="dxa"/>
+              <w:start w:w="140" w:type="dxa"/>
+              <w:bottom w:w="100" w:type="dxa"/>
+              <w:end w:w="140" w:type="dxa"/>
+            </w:tcMar>
+            <w:shd w:fill="F4F6F9"/>
+          </w:tcPr>
+          <w:p>
+            <w:pPr>
+              <w:spacing w:before="0" w:after="40" w:line="300" w:lineRule="auto"/>
+            </w:pPr>
+            <w:r>
+              <w:rPr>
+                <w:rFonts w:ascii="Calibri" w:hAnsi="Calibri" w:eastAsia="Microsoft YaHei"/>
+                <w:b/>
+                <w:color w:val="1F4D78"/>
+                <w:sz w:val="21"/>
+              </w:rPr>
+              <w:t>兑换码说明</w:t>
+            </w:r>
+          </w:p>
+          <w:p>
+            <w:pPr>
+              <w:spacing w:before="0" w:after="0" w:line="288" w:lineRule="auto"/>
+            </w:pPr>
+            <w:r>
+              <w:rPr>
+                <w:rFonts w:ascii="Calibri" w:hAnsi="Calibri" w:eastAsia="Microsoft YaHei"/>
+                <w:color w:val="212529"/>
+                <w:sz w:val="21"/>
+              </w:rPr>
+              <w:t>每个兑换码通常只能使用一次，并且区分大小写。兑换码可以增加余额、并发数或试用/订阅权限。失败时请检查空格、过期和已使用状态，并截图联系客服。</w:t>
+            </w:r>
+          </w:p>
+        </w:tc>
+      </w:tr>
+    </w:tbl>
+    <w:p>
+      <w:pPr>
+        <w:spacing w:after="40"/>
+      </w:pPr>
     </w:p>
     <w:p>
       <w:pPr>
@@ -1304,7 +1485,159 @@
           <w:color w:val="2E74B5"/>
           <w:sz w:val="32"/>
         </w:rPr>
-        <w:t>第五步：在工具里填写 URL 和 Key</w:t>
+        <w:t>第 4 步：创建 API 密钥</w:t>
+      </w:r>
+    </w:p>
+    <w:p>
+      <w:pPr>
+        <w:pStyle w:val="ListNumber"/>
+        <w:spacing w:before="0" w:after="80" w:line="300" w:lineRule="auto"/>
+      </w:pPr>
+      <w:r>
+        <w:rPr>
+          <w:rFonts w:ascii="Calibri" w:hAnsi="Calibri" w:eastAsia="Microsoft YaHei"/>
+          <w:color w:val="212529"/>
+          <w:sz w:val="22"/>
+        </w:rPr>
+        <w:t>进入 /keys 页面并点击「创建密钥」。</w:t>
+      </w:r>
+    </w:p>
+    <w:p>
+      <w:pPr>
+        <w:pStyle w:val="ListNumber"/>
+        <w:spacing w:before="0" w:after="80" w:line="300" w:lineRule="auto"/>
+      </w:pPr>
+      <w:r>
+        <w:rPr>
+          <w:rFonts w:ascii="Calibri" w:hAnsi="Calibri" w:eastAsia="Microsoft YaHei"/>
+          <w:color w:val="212529"/>
+          <w:sz w:val="22"/>
+        </w:rPr>
+        <w:t>给密钥起一个好识别的名字，例如 codex-cli、cursor-work、server-test。</w:t>
+      </w:r>
+    </w:p>
+    <w:p>
+      <w:pPr>
+        <w:pStyle w:val="ListNumber"/>
+        <w:spacing w:before="0" w:after="80" w:line="300" w:lineRule="auto"/>
+      </w:pPr>
+      <w:r>
+        <w:rPr>
+          <w:rFonts w:ascii="Calibri" w:hAnsi="Calibri" w:eastAsia="Microsoft YaHei"/>
+          <w:color w:val="212529"/>
+          <w:sz w:val="22"/>
+        </w:rPr>
+        <w:t>选择一个可用分组。分组决定这个 Key 走哪个模型渠道和费率规则。</w:t>
+      </w:r>
+    </w:p>
+    <w:p>
+      <w:pPr>
+        <w:pStyle w:val="ListNumber"/>
+        <w:spacing w:before="0" w:after="80" w:line="300" w:lineRule="auto"/>
+      </w:pPr>
+      <w:r>
+        <w:rPr>
+          <w:rFonts w:ascii="Calibri" w:hAnsi="Calibri" w:eastAsia="Microsoft YaHei"/>
+          <w:color w:val="212529"/>
+          <w:sz w:val="22"/>
+        </w:rPr>
+        <w:t>按需设置自定义密钥、IP 限制、额度限制、速率限制和密钥有效期。</w:t>
+      </w:r>
+    </w:p>
+    <w:p>
+      <w:pPr>
+        <w:pStyle w:val="ListNumber"/>
+        <w:spacing w:before="0" w:after="80" w:line="300" w:lineRule="auto"/>
+      </w:pPr>
+      <w:r>
+        <w:rPr>
+          <w:rFonts w:ascii="Calibri" w:hAnsi="Calibri" w:eastAsia="Microsoft YaHei"/>
+          <w:color w:val="212529"/>
+          <w:sz w:val="22"/>
+        </w:rPr>
+        <w:t>保存后，在密钥列表里复制 API Key。</w:t>
+      </w:r>
+    </w:p>
+    <w:tbl>
+      <w:tblPr>
+        <w:tblW w:type="dxa" w:w="9360"/>
+        <w:jc w:val="left"/>
+        <w:tblLayout w:type="fixed"/>
+        <w:tblLook w:firstColumn="1" w:firstRow="1" w:lastColumn="0" w:lastRow="0" w:noHBand="0" w:noVBand="1" w:val="04A0"/>
+        <w:tblInd w:w="120" w:type="dxa"/>
+        <w:tblBorders>
+          <w:top w:val="single" w:sz="4" w:space="0" w:color="E2E7EE"/>
+          <w:left w:val="single" w:sz="4" w:space="0" w:color="E2E7EE"/>
+          <w:bottom w:val="single" w:sz="4" w:space="0" w:color="E2E7EE"/>
+          <w:right w:val="single" w:sz="4" w:space="0" w:color="E2E7EE"/>
+          <w:insideH w:val="single" w:sz="4" w:space="0" w:color="E2E7EE"/>
+          <w:insideV w:val="single" w:sz="4" w:space="0" w:color="E2E7EE"/>
+        </w:tblBorders>
+      </w:tblPr>
+      <w:tblGrid>
+        <w:gridCol w:w="9360"/>
+      </w:tblGrid>
+      <w:tr>
+        <w:tc>
+          <w:tcPr>
+            <w:tcW w:type="dxa" w:w="9360"/>
+            <w:vAlign w:val="center"/>
+            <w:tcMar>
+              <w:top w:w="100" w:type="dxa"/>
+              <w:start w:w="140" w:type="dxa"/>
+              <w:bottom w:w="100" w:type="dxa"/>
+              <w:end w:w="140" w:type="dxa"/>
+            </w:tcMar>
+            <w:shd w:fill="F4F6F9"/>
+          </w:tcPr>
+          <w:p>
+            <w:pPr>
+              <w:spacing w:before="0" w:after="40" w:line="300" w:lineRule="auto"/>
+            </w:pPr>
+            <w:r>
+              <w:rPr>
+                <w:rFonts w:ascii="Calibri" w:hAnsi="Calibri" w:eastAsia="Microsoft YaHei"/>
+                <w:b/>
+                <w:color w:val="1F4D78"/>
+                <w:sz w:val="21"/>
+              </w:rPr>
+              <w:t>Key 安全提醒</w:t>
+            </w:r>
+          </w:p>
+          <w:p>
+            <w:pPr>
+              <w:spacing w:before="0" w:after="0" w:line="288" w:lineRule="auto"/>
+            </w:pPr>
+            <w:r>
+              <w:rPr>
+                <w:rFonts w:ascii="Calibri" w:hAnsi="Calibri" w:eastAsia="Microsoft YaHei"/>
+                <w:color w:val="212529"/>
+                <w:sz w:val="21"/>
+              </w:rPr>
+              <w:t>API Key 等同于你的额度使用凭证。不要发到群里，不要贴到公开代码仓库，不要在截图中完整展示。</w:t>
+            </w:r>
+          </w:p>
+        </w:tc>
+      </w:tr>
+    </w:tbl>
+    <w:p>
+      <w:pPr>
+        <w:spacing w:after="40"/>
+      </w:pPr>
+    </w:p>
+    <w:p>
+      <w:pPr>
+        <w:pStyle w:val="Heading1"/>
+        <w:spacing w:before="360" w:after="200" w:line="264" w:lineRule="auto"/>
+      </w:pPr>
+      <w:r>
+        <w:rPr>
+          <w:rFonts w:ascii="Calibri" w:hAnsi="Calibri" w:eastAsia="Microsoft YaHei"/>
+          <w:b/>
+          <w:color w:val="2E74B5"/>
+          <w:sz w:val="32"/>
+        </w:rPr>
+        <w:t>第 5 步：复制 API 地址</w:t>
       </w:r>
     </w:p>
     <w:p>
@@ -1317,7 +1650,7 @@
           <w:color w:val="212529"/>
           <w:sz w:val="22"/>
         </w:rPr>
-        <w:t>大多数支持 OpenAI 兼容接口的工具都会有类似配置项：API Key、Base URL、Endpoint 和 Model。</w:t>
+        <w:t>在 /keys 页面顶部，网站会展示 API 地址信息。如果配置了多个自定义端点，也会在这里显示。</w:t>
       </w:r>
     </w:p>
     <w:tbl>
@@ -1394,7 +1727,7 @@
                 <w:color w:val="212529"/>
                 <w:sz w:val="21"/>
               </w:rPr>
-              <w:t>示例填写</w:t>
+              <w:t>你应该填写</w:t>
             </w:r>
           </w:p>
         </w:tc>
@@ -1446,7 +1779,7 @@
                 <w:color w:val="212529"/>
                 <w:sz w:val="21"/>
               </w:rPr>
-              <w:t>https://你的中转站域名/v1</w:t>
+              <w:t>网站展示的 API Base URL，通常形如 https://你的中转站域名/v1</w:t>
             </w:r>
           </w:p>
         </w:tc>
@@ -1498,7 +1831,7 @@
                 <w:color w:val="212529"/>
                 <w:sz w:val="21"/>
               </w:rPr>
-              <w:t>sk-你的APIKey</w:t>
+              <w:t>/keys 页面复制出来的密钥</w:t>
             </w:r>
           </w:p>
         </w:tc>
@@ -1550,7 +1883,7 @@
                 <w:color w:val="212529"/>
                 <w:sz w:val="21"/>
               </w:rPr>
-              <w:t>gpt-5.5 或后台模型列表中的模型 ID</w:t>
+              <w:t>/available-channels 或工具提示中展示的模型名</w:t>
             </w:r>
           </w:p>
         </w:tc>
@@ -1563,15 +1896,15 @@
     </w:p>
     <w:p>
       <w:pPr>
-        <w:spacing w:before="0" w:after="120" w:line="300" w:lineRule="auto"/>
+        <w:spacing w:before="0" w:after="120" w:line="276" w:lineRule="auto"/>
       </w:pPr>
       <w:r>
         <w:rPr>
-          <w:rFonts w:ascii="Calibri" w:hAnsi="Calibri" w:eastAsia="Microsoft YaHei"/>
-          <w:color w:val="212529"/>
-          <w:sz w:val="22"/>
+          <w:rFonts w:ascii="Consolas" w:hAnsi="Consolas" w:eastAsia="Microsoft YaHei"/>
+          <w:color w:val="1E3050"/>
+          <w:sz w:val="20"/>
         </w:rPr>
-        <w:t>如果工具要求填写完整接口地址，可以填写：</w:t>
+        <w:t>完整接口地址示例：https://你的中转站域名/v1/chat/completions</w:t>
       </w:r>
     </w:p>
     <w:p>
@@ -1584,33 +1917,7 @@
           <w:color w:val="1E3050"/>
           <w:sz w:val="20"/>
         </w:rPr>
-        <w:t>https://你的中转站域名/v1/chat/completions</w:t>
-      </w:r>
-    </w:p>
-    <w:p>
-      <w:pPr>
-        <w:spacing w:before="0" w:after="120" w:line="300" w:lineRule="auto"/>
-      </w:pPr>
-      <w:r>
-        <w:rPr>
-          <w:rFonts w:ascii="Calibri" w:hAnsi="Calibri" w:eastAsia="Microsoft YaHei"/>
-          <w:color w:val="212529"/>
-          <w:sz w:val="22"/>
-        </w:rPr>
-        <w:t>如果工具要求填写 Base URL，通常只填写到 /v1：</w:t>
-      </w:r>
-    </w:p>
-    <w:p>
-      <w:pPr>
-        <w:spacing w:before="0" w:after="120" w:line="276" w:lineRule="auto"/>
-      </w:pPr>
-      <w:r>
-        <w:rPr>
-          <w:rFonts w:ascii="Consolas" w:hAnsi="Consolas" w:eastAsia="Microsoft YaHei"/>
-          <w:color w:val="1E3050"/>
-          <w:sz w:val="20"/>
-        </w:rPr>
-        <w:t>https://你的中转站域名/v1</w:t>
+        <w:t>Base URL 示例：https://你的中转站域名/v1</w:t>
       </w:r>
     </w:p>
     <w:p>
@@ -1625,7 +1932,7 @@
           <w:color w:val="2E74B5"/>
           <w:sz w:val="32"/>
         </w:rPr>
-        <w:t>PowerShell 测试示例</w:t>
+        <w:t>第 6 步：使用「使用密钥」快速配置工具</w:t>
       </w:r>
     </w:p>
     <w:p>
@@ -1638,7 +1945,106 @@
           <w:color w:val="212529"/>
           <w:sz w:val="22"/>
         </w:rPr>
-        <w:t>把下面命令里的域名、Key 和模型名换成你自己的：</w:t>
+        <w:t>在 /keys 页面，每个 Key 后面都有「使用密钥」按钮。点击后，网站会根据该 Key 所属分组展示对应客户端的配置示例。</w:t>
+      </w:r>
+    </w:p>
+    <w:p>
+      <w:pPr>
+        <w:pStyle w:val="ListBullet"/>
+        <w:spacing w:before="0" w:after="80" w:line="300" w:lineRule="auto"/>
+      </w:pPr>
+      <w:r>
+        <w:rPr>
+          <w:rFonts w:ascii="Calibri" w:hAnsi="Calibri" w:eastAsia="Microsoft YaHei"/>
+          <w:color w:val="212529"/>
+          <w:sz w:val="22"/>
+        </w:rPr>
+        <w:t>OpenAI / ChatGPT-5.5 渠道：Codex CLI、Codex CLI WebSocket、OpenCode 等。</w:t>
+      </w:r>
+    </w:p>
+    <w:p>
+      <w:pPr>
+        <w:pStyle w:val="ListBullet"/>
+        <w:spacing w:before="0" w:after="80" w:line="300" w:lineRule="auto"/>
+      </w:pPr>
+      <w:r>
+        <w:rPr>
+          <w:rFonts w:ascii="Calibri" w:hAnsi="Calibri" w:eastAsia="Microsoft YaHei"/>
+          <w:color w:val="212529"/>
+          <w:sz w:val="22"/>
+        </w:rPr>
+        <w:t>Claude 渠道：Claude Code、OpenCode 等。</w:t>
+      </w:r>
+    </w:p>
+    <w:p>
+      <w:pPr>
+        <w:pStyle w:val="ListBullet"/>
+        <w:spacing w:before="0" w:after="80" w:line="300" w:lineRule="auto"/>
+      </w:pPr>
+      <w:r>
+        <w:rPr>
+          <w:rFonts w:ascii="Calibri" w:hAnsi="Calibri" w:eastAsia="Microsoft YaHei"/>
+          <w:color w:val="212529"/>
+          <w:sz w:val="22"/>
+        </w:rPr>
+        <w:t>Gemini 渠道：Gemini CLI、OpenCode 等。</w:t>
+      </w:r>
+    </w:p>
+    <w:p>
+      <w:pPr>
+        <w:pStyle w:val="ListBullet"/>
+        <w:spacing w:before="0" w:after="80" w:line="300" w:lineRule="auto"/>
+      </w:pPr>
+      <w:r>
+        <w:rPr>
+          <w:rFonts w:ascii="Calibri" w:hAnsi="Calibri" w:eastAsia="Microsoft YaHei"/>
+          <w:color w:val="212529"/>
+          <w:sz w:val="22"/>
+        </w:rPr>
+        <w:t>Antigravity 渠道：Claude Code、Gemini CLI、OpenCode 等。</w:t>
+      </w:r>
+    </w:p>
+    <w:p>
+      <w:pPr>
+        <w:pStyle w:val="Heading1"/>
+        <w:spacing w:before="360" w:after="200" w:line="264" w:lineRule="auto"/>
+      </w:pPr>
+      <w:r>
+        <w:rPr>
+          <w:rFonts w:ascii="Calibri" w:hAnsi="Calibri" w:eastAsia="Microsoft YaHei"/>
+          <w:b/>
+          <w:color w:val="2E74B5"/>
+          <w:sz w:val="32"/>
+        </w:rPr>
+        <w:t>OpenAI 兼容接口调用示例</w:t>
+      </w:r>
+    </w:p>
+    <w:p>
+      <w:pPr>
+        <w:spacing w:before="0" w:after="120" w:line="300" w:lineRule="auto"/>
+      </w:pPr>
+      <w:r>
+        <w:rPr>
+          <w:rFonts w:ascii="Calibri" w:hAnsi="Calibri" w:eastAsia="Microsoft YaHei"/>
+          <w:color w:val="212529"/>
+          <w:sz w:val="22"/>
+        </w:rPr>
+        <w:t>请把域名、Key 和模型替换成你网站后台实际显示的内容。</w:t>
+      </w:r>
+    </w:p>
+    <w:p>
+      <w:pPr>
+        <w:pStyle w:val="Heading2"/>
+        <w:spacing w:before="280" w:after="140" w:line="264" w:lineRule="auto"/>
+      </w:pPr>
+      <w:r>
+        <w:rPr>
+          <w:rFonts w:ascii="Calibri" w:hAnsi="Calibri" w:eastAsia="Microsoft YaHei"/>
+          <w:b/>
+          <w:color w:val="2E74B5"/>
+          <w:sz w:val="26"/>
+        </w:rPr>
+        <w:t>PowerShell 测试</w:t>
       </w:r>
     </w:p>
     <w:p>
@@ -1669,17 +2075,17 @@
     </w:p>
     <w:p>
       <w:pPr>
-        <w:pStyle w:val="Heading1"/>
-        <w:spacing w:before="360" w:after="200" w:line="264" w:lineRule="auto"/>
+        <w:pStyle w:val="Heading2"/>
+        <w:spacing w:before="280" w:after="140" w:line="264" w:lineRule="auto"/>
       </w:pPr>
       <w:r>
         <w:rPr>
           <w:rFonts w:ascii="Calibri" w:hAnsi="Calibri" w:eastAsia="Microsoft YaHei"/>
           <w:b/>
           <w:color w:val="2E74B5"/>
-          <w:sz w:val="32"/>
+          <w:sz w:val="26"/>
         </w:rPr>
-        <w:t>Python 调用示例</w:t>
+        <w:t>Python 示例</w:t>
       </w:r>
     </w:p>
     <w:p>
@@ -1734,6 +2140,73 @@
         <w:t>print(response.choices[0].message.content)</w:t>
       </w:r>
     </w:p>
+    <w:tbl>
+      <w:tblPr>
+        <w:tblW w:type="dxa" w:w="9360"/>
+        <w:jc w:val="left"/>
+        <w:tblLayout w:type="fixed"/>
+        <w:tblLook w:firstColumn="1" w:firstRow="1" w:lastColumn="0" w:lastRow="0" w:noHBand="0" w:noVBand="1" w:val="04A0"/>
+        <w:tblInd w:w="120" w:type="dxa"/>
+        <w:tblBorders>
+          <w:top w:val="single" w:sz="4" w:space="0" w:color="E2E7EE"/>
+          <w:left w:val="single" w:sz="4" w:space="0" w:color="E2E7EE"/>
+          <w:bottom w:val="single" w:sz="4" w:space="0" w:color="E2E7EE"/>
+          <w:right w:val="single" w:sz="4" w:space="0" w:color="E2E7EE"/>
+          <w:insideH w:val="single" w:sz="4" w:space="0" w:color="E2E7EE"/>
+          <w:insideV w:val="single" w:sz="4" w:space="0" w:color="E2E7EE"/>
+        </w:tblBorders>
+      </w:tblPr>
+      <w:tblGrid>
+        <w:gridCol w:w="9360"/>
+      </w:tblGrid>
+      <w:tr>
+        <w:tc>
+          <w:tcPr>
+            <w:tcW w:type="dxa" w:w="9360"/>
+            <w:vAlign w:val="center"/>
+            <w:tcMar>
+              <w:top w:w="100" w:type="dxa"/>
+              <w:start w:w="140" w:type="dxa"/>
+              <w:bottom w:w="100" w:type="dxa"/>
+              <w:end w:w="140" w:type="dxa"/>
+            </w:tcMar>
+            <w:shd w:fill="F4F6F9"/>
+          </w:tcPr>
+          <w:p>
+            <w:pPr>
+              <w:spacing w:before="0" w:after="40" w:line="300" w:lineRule="auto"/>
+            </w:pPr>
+            <w:r>
+              <w:rPr>
+                <w:rFonts w:ascii="Calibri" w:hAnsi="Calibri" w:eastAsia="Microsoft YaHei"/>
+                <w:b/>
+                <w:color w:val="1F4D78"/>
+                <w:sz w:val="21"/>
+              </w:rPr>
+              <w:t>模型名以后台为准</w:t>
+            </w:r>
+          </w:p>
+          <w:p>
+            <w:pPr>
+              <w:spacing w:before="0" w:after="0" w:line="288" w:lineRule="auto"/>
+            </w:pPr>
+            <w:r>
+              <w:rPr>
+                <w:rFonts w:ascii="Calibri" w:hAnsi="Calibri" w:eastAsia="Microsoft YaHei"/>
+                <w:color w:val="212529"/>
+                <w:sz w:val="21"/>
+              </w:rPr>
+              <w:t>gpt-5.5 只是示例模型名。客户能使用哪些模型，请以 /available-channels 和后台模型列表为准。</w:t>
+            </w:r>
+          </w:p>
+        </w:tc>
+      </w:tr>
+    </w:tbl>
+    <w:p>
+      <w:pPr>
+        <w:spacing w:after="40"/>
+      </w:pPr>
+    </w:p>
     <w:p>
       <w:pPr>
         <w:pStyle w:val="Heading1"/>
@@ -1746,27 +2219,13 @@
           <w:color w:val="2E74B5"/>
           <w:sz w:val="32"/>
         </w:rPr>
-        <w:t>使用中转站的优势</w:t>
+        <w:t>查看用量和余额</w:t>
       </w:r>
     </w:p>
     <w:p>
       <w:pPr>
-        <w:pStyle w:val="Heading2"/>
-        <w:spacing w:before="280" w:after="140" w:line="264" w:lineRule="auto"/>
-      </w:pPr>
-      <w:r>
-        <w:rPr>
-          <w:rFonts w:ascii="Calibri" w:hAnsi="Calibri" w:eastAsia="Microsoft YaHei"/>
-          <w:b/>
-          <w:color w:val="2E74B5"/>
-          <w:sz w:val="26"/>
-        </w:rPr>
-        <w:t>不用自己折腾 VPN 或海外网络</w:t>
-      </w:r>
-    </w:p>
-    <w:p>
-      <w:pPr>
-        <w:spacing w:before="0" w:after="120" w:line="300" w:lineRule="auto"/>
+        <w:pStyle w:val="ListBullet"/>
+        <w:spacing w:before="0" w:after="80" w:line="300" w:lineRule="auto"/>
       </w:pPr>
       <w:r>
         <w:rPr>
@@ -1774,27 +2233,13 @@
           <w:color w:val="212529"/>
           <w:sz w:val="22"/>
         </w:rPr>
-        <w:t>很多用户直接访问海外大模型服务时，会遇到网络不稳定、连接失败或配置复杂的问题。使用中转站后，你只需要访问平台提供的 API URL，通常不需要自己单独准备 VPN 或海外网络环境。</w:t>
+        <w:t>/dashboard：账户概览、余额、快捷入口。</w:t>
       </w:r>
     </w:p>
     <w:p>
       <w:pPr>
-        <w:pStyle w:val="Heading2"/>
-        <w:spacing w:before="280" w:after="140" w:line="264" w:lineRule="auto"/>
-      </w:pPr>
-      <w:r>
-        <w:rPr>
-          <w:rFonts w:ascii="Calibri" w:hAnsi="Calibri" w:eastAsia="Microsoft YaHei"/>
-          <w:b/>
-          <w:color w:val="2E74B5"/>
-          <w:sz w:val="26"/>
-        </w:rPr>
-        <w:t>一个入口调用多种大模型</w:t>
-      </w:r>
-    </w:p>
-    <w:p>
-      <w:pPr>
-        <w:spacing w:before="0" w:after="120" w:line="300" w:lineRule="auto"/>
+        <w:pStyle w:val="ListBullet"/>
+        <w:spacing w:before="0" w:after="80" w:line="300" w:lineRule="auto"/>
       </w:pPr>
       <w:r>
         <w:rPr>
@@ -1802,27 +2247,13 @@
           <w:color w:val="212529"/>
           <w:sz w:val="22"/>
         </w:rPr>
-        <w:t>中转站可以把多个模型入口集中到一个后台里。你可以按需使用 OpenAI 的 ChatGPT-5.5 / GPT-5.5 系列，以及平台支持的其他模型。实际开放哪些模型、模型 ID 怎么写、价格是多少，请以后台模型列表为准。</w:t>
+        <w:t>/usage：请求记录、模型用量、费用明细。</w:t>
       </w:r>
     </w:p>
     <w:p>
       <w:pPr>
-        <w:pStyle w:val="Heading2"/>
-        <w:spacing w:before="280" w:after="140" w:line="264" w:lineRule="auto"/>
-      </w:pPr>
-      <w:r>
-        <w:rPr>
-          <w:rFonts w:ascii="Calibri" w:hAnsi="Calibri" w:eastAsia="Microsoft YaHei"/>
-          <w:b/>
-          <w:color w:val="2E74B5"/>
-          <w:sz w:val="26"/>
-        </w:rPr>
-        <w:t>对 OpenAI 兼容工具更友好</w:t>
-      </w:r>
-    </w:p>
-    <w:p>
-      <w:pPr>
-        <w:spacing w:before="0" w:after="120" w:line="300" w:lineRule="auto"/>
+        <w:pStyle w:val="ListBullet"/>
+        <w:spacing w:before="0" w:after="80" w:line="300" w:lineRule="auto"/>
       </w:pPr>
       <w:r>
         <w:rPr>
@@ -1830,27 +2261,13 @@
           <w:color w:val="212529"/>
           <w:sz w:val="22"/>
         </w:rPr>
-        <w:t>很多开发工具、聊天客户端、IDE 插件和自动化工具都支持 OpenAI 兼容接口。只要工具允许填写自定义 Base URL 和 API Key，通常就可以接入中转站。</w:t>
+        <w:t>/keys：每个 API Key 的今日用量、总用量、额度进度和状态。</w:t>
       </w:r>
     </w:p>
     <w:p>
       <w:pPr>
-        <w:pStyle w:val="Heading2"/>
-        <w:spacing w:before="280" w:after="140" w:line="264" w:lineRule="auto"/>
-      </w:pPr>
-      <w:r>
-        <w:rPr>
-          <w:rFonts w:ascii="Calibri" w:hAnsi="Calibri" w:eastAsia="Microsoft YaHei"/>
-          <w:b/>
-          <w:color w:val="2E74B5"/>
-          <w:sz w:val="26"/>
-        </w:rPr>
-        <w:t>余额、用量和成本更清楚</w:t>
-      </w:r>
-    </w:p>
-    <w:p>
-      <w:pPr>
-        <w:spacing w:before="0" w:after="120" w:line="300" w:lineRule="auto"/>
+        <w:pStyle w:val="ListBullet"/>
+        <w:spacing w:before="0" w:after="80" w:line="300" w:lineRule="auto"/>
       </w:pPr>
       <w:r>
         <w:rPr>
@@ -1858,27 +2275,13 @@
           <w:color w:val="212529"/>
           <w:sz w:val="22"/>
         </w:rPr>
-        <w:t>后台通常可以查看余额、充值记录、兑换记录和调用用量。这样你能知道额度花在哪里，也能更容易控制成本。</w:t>
+        <w:t>/key-usage：不登录也可用 API Key 查询用量，适合给团队成员自查。</w:t>
       </w:r>
     </w:p>
     <w:p>
       <w:pPr>
-        <w:pStyle w:val="Heading2"/>
-        <w:spacing w:before="280" w:after="140" w:line="264" w:lineRule="auto"/>
-      </w:pPr>
-      <w:r>
-        <w:rPr>
-          <w:rFonts w:ascii="Calibri" w:hAnsi="Calibri" w:eastAsia="Microsoft YaHei"/>
-          <w:b/>
-          <w:color w:val="2E74B5"/>
-          <w:sz w:val="26"/>
-        </w:rPr>
-        <w:t>更适合团队和多工具使用</w:t>
-      </w:r>
-    </w:p>
-    <w:p>
-      <w:pPr>
-        <w:spacing w:before="0" w:after="120" w:line="300" w:lineRule="auto"/>
+        <w:pStyle w:val="ListBullet"/>
+        <w:spacing w:before="0" w:after="80" w:line="300" w:lineRule="auto"/>
       </w:pPr>
       <w:r>
         <w:rPr>
@@ -1886,27 +2289,13 @@
           <w:color w:val="212529"/>
           <w:sz w:val="22"/>
         </w:rPr>
-        <w:t>你可以为不同工具或成员创建不同 API Key。后续如果某个 Key 不再使用，可以单独删除，不影响其他 Key。</w:t>
+        <w:t>/orders：查看充值或订阅订单。</w:t>
       </w:r>
     </w:p>
     <w:p>
       <w:pPr>
-        <w:pStyle w:val="Heading2"/>
-        <w:spacing w:before="280" w:after="140" w:line="264" w:lineRule="auto"/>
-      </w:pPr>
-      <w:r>
-        <w:rPr>
-          <w:rFonts w:ascii="Calibri" w:hAnsi="Calibri" w:eastAsia="Microsoft YaHei"/>
-          <w:b/>
-          <w:color w:val="2E74B5"/>
-          <w:sz w:val="26"/>
-        </w:rPr>
-        <w:t>降低账号和接口维护成本</w:t>
-      </w:r>
-    </w:p>
-    <w:p>
-      <w:pPr>
-        <w:spacing w:before="0" w:after="120" w:line="300" w:lineRule="auto"/>
+        <w:pStyle w:val="ListBullet"/>
+        <w:spacing w:before="0" w:after="80" w:line="300" w:lineRule="auto"/>
       </w:pPr>
       <w:r>
         <w:rPr>
@@ -1914,7 +2303,7 @@
           <w:color w:val="212529"/>
           <w:sz w:val="22"/>
         </w:rPr>
-        <w:t>用户不用分别研究多个模型厂商的账号、充值、接口格式和网络配置。中转站会把常用能力集中起来，让新用户更容易上手。</w:t>
+        <w:t>/redeem：查看兑换历史。</w:t>
       </w:r>
     </w:p>
     <w:p>
@@ -1944,7 +2333,7 @@
           <w:color w:val="2E74B5"/>
           <w:sz w:val="26"/>
         </w:rPr>
-        <w:t>兑换码输入后提示无效怎么办？</w:t>
+        <w:t>兑换码不能用怎么办？</w:t>
       </w:r>
     </w:p>
     <w:p>
@@ -1957,7 +2346,7 @@
           <w:color w:val="212529"/>
           <w:sz w:val="22"/>
         </w:rPr>
-        <w:t>先检查是否复制错字符、是否多了空格、是否大小写错误。如果仍然无效，截图联系平台客服。</w:t>
+        <w:t>确认兑换码没有多复制空格、没有大小写错误、没有过期，也没有被使用过。如果仍然失败，请截图发给客服。</w:t>
       </w:r>
     </w:p>
     <w:p>
@@ -1972,7 +2361,7 @@
           <w:color w:val="2E74B5"/>
           <w:sz w:val="26"/>
         </w:rPr>
-        <w:t>为什么提示余额不足？</w:t>
+        <w:t>余额到账了，为什么工具还是不能调用？</w:t>
       </w:r>
     </w:p>
     <w:p>
@@ -1985,7 +2374,7 @@
           <w:color w:val="212529"/>
           <w:sz w:val="22"/>
         </w:rPr>
-        <w:t>可能是兑换码没有到账、余额已经用完，或当前模型单价较高。请先检查后台余额和用量记录。</w:t>
+        <w:t>请检查 /keys 页面是否已经创建 API Key，并确认 Key 已分配分组。没有分组的 Key 不能正确展示对应使用配置。</w:t>
       </w:r>
     </w:p>
     <w:p>
@@ -2000,7 +2389,7 @@
           <w:color w:val="2E74B5"/>
           <w:sz w:val="26"/>
         </w:rPr>
-        <w:t>为什么提示 Key 错误或 401？</w:t>
+        <w:t>为什么提示 401 或 Key 无效？</w:t>
       </w:r>
     </w:p>
     <w:p>
@@ -2013,7 +2402,7 @@
           <w:color w:val="212529"/>
           <w:sz w:val="22"/>
         </w:rPr>
-        <w:t>通常是 API Key 复制错了、Key 已删除、Key 前后有空格，或者请求头没有写成 Authorization: Bearer sk-你的APIKey。</w:t>
+        <w:t>通常是 API Key 复制错了、Key 已禁用、Key 已删除、Key 过期，或者请求头没有写成 Authorization: Bearer sk-你的APIKey。</w:t>
       </w:r>
     </w:p>
     <w:p>
@@ -2041,7 +2430,7 @@
           <w:color w:val="212529"/>
           <w:sz w:val="22"/>
         </w:rPr>
-        <w:t>模型名必须和后台模型列表一致。请进入模型列表复制模型 ID，不要凭感觉手动输入。</w:t>
+        <w:t>模型名必须和后台开放的模型名一致。请在 /available-channels 或「使用密钥」弹窗里复制模型名，不要手打猜测。</w:t>
       </w:r>
     </w:p>
     <w:p>
@@ -2056,7 +2445,7 @@
           <w:color w:val="2E74B5"/>
           <w:sz w:val="26"/>
         </w:rPr>
-        <w:t>为什么工具连不上？</w:t>
+        <w:t>为什么请求超时或失败？</w:t>
       </w:r>
     </w:p>
     <w:p>
@@ -2069,7 +2458,7 @@
           <w:color w:val="212529"/>
           <w:sz w:val="22"/>
         </w:rPr>
-        <w:t>请检查 Base URL 是否填写到 /v1，域名是否写错，网络是否能打开中转站后台。如果工具有代理设置，也请检查代理是否影响请求。</w:t>
+        <w:t>可以先看 /monitor 渠道状态。如果某个渠道临时异常，可以切换到其他可用渠道，或联系客服确认当前模型状态。</w:t>
       </w:r>
     </w:p>
     <w:p>
@@ -2084,7 +2473,7 @@
           <w:color w:val="2E74B5"/>
           <w:sz w:val="26"/>
         </w:rPr>
-        <w:t>Key 可以发给别人吗？</w:t>
+        <w:t>我需要 VPN 吗？</w:t>
       </w:r>
     </w:p>
     <w:p>
@@ -2097,7 +2486,7 @@
           <w:color w:val="212529"/>
           <w:sz w:val="22"/>
         </w:rPr>
-        <w:t>不建议。Key 等同于你的额度使用凭证。别人拿到 Key 后产生的消耗，会计入你的账号。</w:t>
+        <w:t>正常使用我们的网站和 API 中转服务时，通常不需要你自己准备 VPN。你只需要能访问我们提供的网站域名和 API 地址。</w:t>
       </w:r>
     </w:p>
     <w:p>
@@ -2112,7 +2501,133 @@
           <w:color w:val="2E74B5"/>
           <w:sz w:val="32"/>
         </w:rPr>
-        <w:t>安全提醒</w:t>
+        <w:t>给客服排查时请提供</w:t>
+      </w:r>
+    </w:p>
+    <w:p>
+      <w:pPr>
+        <w:pStyle w:val="ListNumber"/>
+        <w:spacing w:before="0" w:after="80" w:line="300" w:lineRule="auto"/>
+      </w:pPr>
+      <w:r>
+        <w:rPr>
+          <w:rFonts w:ascii="Calibri" w:hAnsi="Calibri" w:eastAsia="Microsoft YaHei"/>
+          <w:color w:val="212529"/>
+          <w:sz w:val="22"/>
+        </w:rPr>
+        <w:t>注册邮箱或账号。</w:t>
+      </w:r>
+    </w:p>
+    <w:p>
+      <w:pPr>
+        <w:pStyle w:val="ListNumber"/>
+        <w:spacing w:before="0" w:after="80" w:line="300" w:lineRule="auto"/>
+      </w:pPr>
+      <w:r>
+        <w:rPr>
+          <w:rFonts w:ascii="Calibri" w:hAnsi="Calibri" w:eastAsia="Microsoft YaHei"/>
+          <w:color w:val="212529"/>
+          <w:sz w:val="22"/>
+        </w:rPr>
+        <w:t>当前使用的网址。</w:t>
+      </w:r>
+    </w:p>
+    <w:p>
+      <w:pPr>
+        <w:pStyle w:val="ListNumber"/>
+        <w:spacing w:before="0" w:after="80" w:line="300" w:lineRule="auto"/>
+      </w:pPr>
+      <w:r>
+        <w:rPr>
+          <w:rFonts w:ascii="Calibri" w:hAnsi="Calibri" w:eastAsia="Microsoft YaHei"/>
+          <w:color w:val="212529"/>
+          <w:sz w:val="22"/>
+        </w:rPr>
+        <w:t>兑换码失败截图，或订单号。</w:t>
+      </w:r>
+    </w:p>
+    <w:p>
+      <w:pPr>
+        <w:pStyle w:val="ListNumber"/>
+        <w:spacing w:before="0" w:after="80" w:line="300" w:lineRule="auto"/>
+      </w:pPr>
+      <w:r>
+        <w:rPr>
+          <w:rFonts w:ascii="Calibri" w:hAnsi="Calibri" w:eastAsia="Microsoft YaHei"/>
+          <w:color w:val="212529"/>
+          <w:sz w:val="22"/>
+        </w:rPr>
+        <w:t>/keys 页面密钥名称和所属分组截图。</w:t>
+      </w:r>
+    </w:p>
+    <w:p>
+      <w:pPr>
+        <w:pStyle w:val="ListNumber"/>
+        <w:spacing w:before="0" w:after="80" w:line="300" w:lineRule="auto"/>
+      </w:pPr>
+      <w:r>
+        <w:rPr>
+          <w:rFonts w:ascii="Calibri" w:hAnsi="Calibri" w:eastAsia="Microsoft YaHei"/>
+          <w:color w:val="212529"/>
+          <w:sz w:val="22"/>
+        </w:rPr>
+        <w:t>工具里填写的 Base URL 截图。</w:t>
+      </w:r>
+    </w:p>
+    <w:p>
+      <w:pPr>
+        <w:pStyle w:val="ListNumber"/>
+        <w:spacing w:before="0" w:after="80" w:line="300" w:lineRule="auto"/>
+      </w:pPr>
+      <w:r>
+        <w:rPr>
+          <w:rFonts w:ascii="Calibri" w:hAnsi="Calibri" w:eastAsia="Microsoft YaHei"/>
+          <w:color w:val="212529"/>
+          <w:sz w:val="22"/>
+        </w:rPr>
+        <w:t>报错截图。</w:t>
+      </w:r>
+    </w:p>
+    <w:p>
+      <w:pPr>
+        <w:pStyle w:val="ListNumber"/>
+        <w:spacing w:before="0" w:after="80" w:line="300" w:lineRule="auto"/>
+      </w:pPr>
+      <w:r>
+        <w:rPr>
+          <w:rFonts w:ascii="Calibri" w:hAnsi="Calibri" w:eastAsia="Microsoft YaHei"/>
+          <w:color w:val="212529"/>
+          <w:sz w:val="22"/>
+        </w:rPr>
+        <w:t>大概发生时间。</w:t>
+      </w:r>
+    </w:p>
+    <w:p>
+      <w:pPr>
+        <w:spacing w:before="0" w:after="120" w:line="300" w:lineRule="auto"/>
+      </w:pPr>
+      <w:r>
+        <w:rPr>
+          <w:rFonts w:ascii="Calibri" w:hAnsi="Calibri" w:eastAsia="Microsoft YaHei"/>
+          <w:color w:val="212529"/>
+          <w:sz w:val="22"/>
+        </w:rPr>
+        <w:t>截图时请遮挡 API Key，只保留前后 4 到 6 位用于识别即可。</w:t>
+      </w:r>
+    </w:p>
+    <w:p>
+      <w:pPr>
+        <w:pStyle w:val="Heading1"/>
+        <w:spacing w:before="360" w:after="200" w:line="264" w:lineRule="auto"/>
+      </w:pPr>
+      <w:r>
+        <w:rPr>
+          <w:rFonts w:ascii="Calibri" w:hAnsi="Calibri" w:eastAsia="Microsoft YaHei"/>
+          <w:b/>
+          <w:color w:val="2E74B5"/>
+          <w:sz w:val="32"/>
+        </w:rPr>
+        <w:t>安全使用提醒</w:t>
       </w:r>
     </w:p>
     <w:p>
@@ -2140,7 +2655,7 @@
           <w:color w:val="212529"/>
           <w:sz w:val="22"/>
         </w:rPr>
-        <w:t>不要把 Key 写进公开仓库。</w:t>
+        <w:t>不要把 Key 写进公开 GitHub 仓库。</w:t>
       </w:r>
     </w:p>
     <w:p>
@@ -2154,7 +2669,7 @@
           <w:color w:val="212529"/>
           <w:sz w:val="22"/>
         </w:rPr>
-        <w:t>不要在截图里暴露 Key。</w:t>
+        <w:t>不要在截图、直播、录屏里完整展示 Key。</w:t>
       </w:r>
     </w:p>
     <w:p>
@@ -2168,7 +2683,7 @@
           <w:color w:val="212529"/>
           <w:sz w:val="22"/>
         </w:rPr>
-        <w:t>定期查看用量记录，发现异常及时停用旧 Key。</w:t>
+        <w:t>给服务器使用的 Key 建议设置 IP 白名单。</w:t>
       </w:r>
     </w:p>
     <w:p>
@@ -2182,7 +2697,7 @@
           <w:color w:val="212529"/>
           <w:sz w:val="22"/>
         </w:rPr>
-        <w:t>只在可信工具里填写 URL 和 Key。</w:t>
+        <w:t>给临时测试使用的 Key 建议设置有效期和额度限制。</w:t>
       </w:r>
     </w:p>
     <w:p>
@@ -2196,40 +2711,12 @@
           <w:color w:val="212529"/>
           <w:sz w:val="22"/>
         </w:rPr>
-        <w:t>不要用平台进行违法、违规或侵犯他人权益的内容生成与调用。</w:t>
+        <w:t>发现异常用量时，先禁用旧 Key，再联系平台客服。</w:t>
       </w:r>
     </w:p>
     <w:p>
       <w:pPr>
-        <w:pStyle w:val="Heading1"/>
-        <w:spacing w:before="360" w:after="200" w:line="264" w:lineRule="auto"/>
-      </w:pPr>
-      <w:r>
-        <w:rPr>
-          <w:rFonts w:ascii="Calibri" w:hAnsi="Calibri" w:eastAsia="Microsoft YaHei"/>
-          <w:b/>
-          <w:color w:val="2E74B5"/>
-          <w:sz w:val="32"/>
-        </w:rPr>
-        <w:t>给客服或管理员的信息</w:t>
-      </w:r>
-    </w:p>
-    <w:p>
-      <w:pPr>
-        <w:spacing w:before="0" w:after="120" w:line="300" w:lineRule="auto"/>
-      </w:pPr>
-      <w:r>
-        <w:rPr>
-          <w:rFonts w:ascii="Calibri" w:hAnsi="Calibri" w:eastAsia="Microsoft YaHei"/>
-          <w:color w:val="212529"/>
-          <w:sz w:val="22"/>
-        </w:rPr>
-        <w:t>如果用户无法完成配置，可以让用户提供以下信息，方便排查。请提醒用户：截图时务必遮挡 API Key，只保留前后少量字符用于识别即可。</w:t>
-      </w:r>
-    </w:p>
-    <w:p>
-      <w:pPr>
-        <w:pStyle w:val="ListNumber"/>
+        <w:pStyle w:val="ListBullet"/>
         <w:spacing w:before="0" w:after="80" w:line="300" w:lineRule="auto"/>
       </w:pPr>
       <w:r>
@@ -2238,77 +2725,7 @@
           <w:color w:val="212529"/>
           <w:sz w:val="22"/>
         </w:rPr>
-        <w:t>注册账号或邮箱。</w:t>
-      </w:r>
-    </w:p>
-    <w:p>
-      <w:pPr>
-        <w:pStyle w:val="ListNumber"/>
-        <w:spacing w:before="0" w:after="80" w:line="300" w:lineRule="auto"/>
-      </w:pPr>
-      <w:r>
-        <w:rPr>
-          <w:rFonts w:ascii="Calibri" w:hAnsi="Calibri" w:eastAsia="Microsoft YaHei"/>
-          <w:color w:val="212529"/>
-          <w:sz w:val="22"/>
-        </w:rPr>
-        <w:t>兑换码截图或兑换提示截图。</w:t>
-      </w:r>
-    </w:p>
-    <w:p>
-      <w:pPr>
-        <w:pStyle w:val="ListNumber"/>
-        <w:spacing w:before="0" w:after="80" w:line="300" w:lineRule="auto"/>
-      </w:pPr>
-      <w:r>
-        <w:rPr>
-          <w:rFonts w:ascii="Calibri" w:hAnsi="Calibri" w:eastAsia="Microsoft YaHei"/>
-          <w:color w:val="212529"/>
-          <w:sz w:val="22"/>
-        </w:rPr>
-        <w:t>后台余额截图。</w:t>
-      </w:r>
-    </w:p>
-    <w:p>
-      <w:pPr>
-        <w:pStyle w:val="ListNumber"/>
-        <w:spacing w:before="0" w:after="80" w:line="300" w:lineRule="auto"/>
-      </w:pPr>
-      <w:r>
-        <w:rPr>
-          <w:rFonts w:ascii="Calibri" w:hAnsi="Calibri" w:eastAsia="Microsoft YaHei"/>
-          <w:color w:val="212529"/>
-          <w:sz w:val="22"/>
-        </w:rPr>
-        <w:t>工具里的 Base URL 截图。</w:t>
-      </w:r>
-    </w:p>
-    <w:p>
-      <w:pPr>
-        <w:pStyle w:val="ListNumber"/>
-        <w:spacing w:before="0" w:after="80" w:line="300" w:lineRule="auto"/>
-      </w:pPr>
-      <w:r>
-        <w:rPr>
-          <w:rFonts w:ascii="Calibri" w:hAnsi="Calibri" w:eastAsia="Microsoft YaHei"/>
-          <w:color w:val="212529"/>
-          <w:sz w:val="22"/>
-        </w:rPr>
-        <w:t>工具里的模型名截图。</w:t>
-      </w:r>
-    </w:p>
-    <w:p>
-      <w:pPr>
-        <w:pStyle w:val="ListNumber"/>
-        <w:spacing w:before="0" w:after="80" w:line="300" w:lineRule="auto"/>
-      </w:pPr>
-      <w:r>
-        <w:rPr>
-          <w:rFonts w:ascii="Calibri" w:hAnsi="Calibri" w:eastAsia="Microsoft YaHei"/>
-          <w:color w:val="212529"/>
-          <w:sz w:val="22"/>
-        </w:rPr>
-        <w:t>报错信息截图。</w:t>
+        <w:t>不要使用本服务生成、传播或处理违法违规内容。</w:t>
       </w:r>
     </w:p>
     <w:sectPr>
@@ -2355,7 +2772,7 @@
         <w:color w:val="5B6770"/>
         <w:sz w:val="18"/>
       </w:rPr>
-      <w:t>中转站新手说明书</w:t>
+      <w:t>AI 中转站客户指南</w:t>
     </w:r>
   </w:p>
 </w:hdr>

</xml_diff>